<commit_message>
Commit 130: Atualiza a documentação do Word
</commit_message>
<xml_diff>
--- a/documents/requirements.docx
+++ b/documents/requirements.docx
@@ -1,6 +1,6 @@
 
 <file path=word/document.xml><?xml version="1.0" encoding="utf-8"?>
-<w:document xmlns:wpc="http://schemas.microsoft.com/office/word/2010/wordprocessingCanvas" xmlns:cx="http://schemas.microsoft.com/office/drawing/2014/chartex" xmlns:cx1="http://schemas.microsoft.com/office/drawing/2015/9/8/chartex" xmlns:cx2="http://schemas.microsoft.com/office/drawing/2015/10/21/chartex" xmlns:cx3="http://schemas.microsoft.com/office/drawing/2016/5/9/chartex" xmlns:cx4="http://schemas.microsoft.com/office/drawing/2016/5/10/chartex" xmlns:cx5="http://schemas.microsoft.com/office/drawing/2016/5/11/chartex" xmlns:cx6="http://schemas.microsoft.com/office/drawing/2016/5/12/chartex" xmlns:cx7="http://schemas.microsoft.com/office/drawing/2016/5/13/chartex" xmlns:cx8="http://schemas.microsoft.com/office/drawing/2016/5/14/chartex" xmlns:mc="http://schemas.openxmlformats.org/markup-compatibility/2006" xmlns:aink="http://schemas.microsoft.com/office/drawing/2016/ink" xmlns:am3d="http://schemas.microsoft.com/office/drawing/2017/model3d" xmlns:o="urn:schemas-microsoft-com:office:office" xmlns:oel="http://schemas.microsoft.com/office/2019/extlst" xmlns:r="http://schemas.openxmlformats.org/officeDocument/2006/relationships" xmlns:m="http://schemas.openxmlformats.org/officeDocument/2006/math" xmlns:v="urn:schemas-microsoft-com:vml" xmlns:wp14="http://schemas.microsoft.com/office/word/2010/wordprocessingDrawing" xmlns:wp="http://schemas.openxmlformats.org/drawingml/2006/wordprocessingDrawing" xmlns:w10="urn:schemas-microsoft-com:office:word" xmlns:w="http://schemas.openxmlformats.org/wordprocessingml/2006/main" xmlns:w14="http://schemas.microsoft.com/office/word/2010/wordml" xmlns:w15="http://schemas.microsoft.com/office/word/2012/wordml" xmlns:w16cex="http://schemas.microsoft.com/office/word/2018/wordml/cex" xmlns:w16cid="http://schemas.microsoft.com/office/word/2016/wordml/cid" xmlns:w16="http://schemas.microsoft.com/office/word/2018/wordml" xmlns:w16du="http://schemas.microsoft.com/office/word/2023/wordml/word16du" xmlns:w16sdtdh="http://schemas.microsoft.com/office/word/2020/wordml/sdtdatahash" xmlns:w16sdtfl="http://schemas.microsoft.com/office/word/2024/wordml/sdtformatlock" xmlns:w16se="http://schemas.microsoft.com/office/word/2015/wordml/symex" xmlns:wpg="http://schemas.microsoft.com/office/word/2010/wordprocessingGroup" xmlns:wpi="http://schemas.microsoft.com/office/word/2010/wordprocessingInk" xmlns:wne="http://schemas.microsoft.com/office/word/2006/wordml" xmlns:wps="http://schemas.microsoft.com/office/word/2010/wordprocessingShape" mc:Ignorable="w14 w15 w16se w16cid w16 w16cex w16sdtdh w16sdtfl w16du wp14">
+<w:document xmlns:wpc="http://schemas.microsoft.com/office/word/2010/wordprocessingCanvas" xmlns:cx="http://schemas.microsoft.com/office/drawing/2014/chartex" xmlns:cx1="http://schemas.microsoft.com/office/drawing/2015/9/8/chartex" xmlns:cx2="http://schemas.microsoft.com/office/drawing/2015/10/21/chartex" xmlns:cx3="http://schemas.microsoft.com/office/drawing/2016/5/9/chartex" xmlns:cx4="http://schemas.microsoft.com/office/drawing/2016/5/10/chartex" xmlns:cx5="http://schemas.microsoft.com/office/drawing/2016/5/11/chartex" xmlns:cx6="http://schemas.microsoft.com/office/drawing/2016/5/12/chartex" xmlns:cx7="http://schemas.microsoft.com/office/drawing/2016/5/13/chartex" xmlns:cx8="http://schemas.microsoft.com/office/drawing/2016/5/14/chartex" xmlns:mc="http://schemas.openxmlformats.org/markup-compatibility/2006" xmlns:aink="http://schemas.microsoft.com/office/drawing/2016/ink" xmlns:am3d="http://schemas.microsoft.com/office/drawing/2017/model3d" xmlns:o="urn:schemas-microsoft-com:office:office" xmlns:oel="http://schemas.microsoft.com/office/2019/extlst" xmlns:r="http://schemas.openxmlformats.org/officeDocument/2006/relationships" xmlns:m="http://schemas.openxmlformats.org/officeDocument/2006/math" xmlns:v="urn:schemas-microsoft-com:vml" xmlns:wp14="http://schemas.microsoft.com/office/word/2010/wordprocessingDrawing" xmlns:wp="http://schemas.openxmlformats.org/drawingml/2006/wordprocessingDrawing" xmlns:w10="urn:schemas-microsoft-com:office:word" xmlns:w="http://schemas.openxmlformats.org/wordprocessingml/2006/main" xmlns:w14="http://schemas.microsoft.com/office/word/2010/wordml" xmlns:w15="http://schemas.microsoft.com/office/word/2012/wordml" xmlns:w16cex="http://schemas.microsoft.com/office/word/2018/wordml/cex" xmlns:w16cid="http://schemas.microsoft.com/office/word/2016/wordml/cid" xmlns:w16="http://schemas.microsoft.com/office/word/2018/wordml" xmlns:w16sdtdh="http://schemas.microsoft.com/office/word/2020/wordml/sdtdatahash" xmlns:w16se="http://schemas.microsoft.com/office/word/2015/wordml/symex" xmlns:wpg="http://schemas.microsoft.com/office/word/2010/wordprocessingGroup" xmlns:wpi="http://schemas.microsoft.com/office/word/2010/wordprocessingInk" xmlns:wne="http://schemas.microsoft.com/office/word/2006/wordml" xmlns:wps="http://schemas.microsoft.com/office/word/2010/wordprocessingShape" mc:Ignorable="w14 w15 w16se w16cid w16 w16cex w16sdtdh wp14">
   <w:body>
     <w:p>
       <w:pPr>
@@ -153,25 +153,7 @@
           <w:bCs/>
           <w:color w:val="1F4E79"/>
         </w:rPr>
-        <w:t xml:space="preserve">  </w:t>
-      </w:r>
-      <w:proofErr w:type="gramStart"/>
-      <w:r>
-        <w:rPr>
-          <w:b/>
-          <w:bCs/>
-          <w:color w:val="1F4E79"/>
-        </w:rPr>
-        <w:t>—  Cursos</w:t>
-      </w:r>
-      <w:proofErr w:type="gramEnd"/>
-      <w:r>
-        <w:rPr>
-          <w:b/>
-          <w:bCs/>
-          <w:color w:val="1F4E79"/>
-        </w:rPr>
-        <w:t xml:space="preserve"> técnicos da escola</w:t>
+        <w:t xml:space="preserve">  —  Cursos técnicos da escola</w:t>
       </w:r>
     </w:p>
     <w:tbl>
@@ -198,12 +180,6 @@
         <w:gridCol w:w="3300"/>
       </w:tblGrid>
       <w:tr>
-        <w:tblPrEx>
-          <w:tblCellMar>
-            <w:top w:w="0" w:type="dxa"/>
-            <w:bottom w:w="0" w:type="dxa"/>
-          </w:tblCellMar>
-        </w:tblPrEx>
         <w:trPr>
           <w:tblHeader/>
         </w:trPr>
@@ -341,12 +317,6 @@
         </w:tc>
       </w:tr>
       <w:tr>
-        <w:tblPrEx>
-          <w:tblCellMar>
-            <w:top w:w="0" w:type="dxa"/>
-            <w:bottom w:w="0" w:type="dxa"/>
-          </w:tblCellMar>
-        </w:tblPrEx>
         <w:tc>
           <w:tcPr>
             <w:tcW w:w="2500" w:type="dxa"/>
@@ -465,12 +435,6 @@
         </w:tc>
       </w:tr>
       <w:tr>
-        <w:tblPrEx>
-          <w:tblCellMar>
-            <w:top w:w="0" w:type="dxa"/>
-            <w:bottom w:w="0" w:type="dxa"/>
-          </w:tblCellMar>
-        </w:tblPrEx>
         <w:tc>
           <w:tcPr>
             <w:tcW w:w="2500" w:type="dxa"/>
@@ -609,12 +573,6 @@
         </w:tc>
       </w:tr>
       <w:tr>
-        <w:tblPrEx>
-          <w:tblCellMar>
-            <w:top w:w="0" w:type="dxa"/>
-            <w:bottom w:w="0" w:type="dxa"/>
-          </w:tblCellMar>
-        </w:tblPrEx>
         <w:tc>
           <w:tcPr>
             <w:tcW w:w="2500" w:type="dxa"/>
@@ -778,43 +736,7 @@
           <w:bCs/>
           <w:color w:val="1F4E79"/>
         </w:rPr>
-        <w:t xml:space="preserve">  </w:t>
-      </w:r>
-      <w:proofErr w:type="gramStart"/>
-      <w:r>
-        <w:rPr>
-          <w:b/>
-          <w:bCs/>
-          <w:color w:val="1F4E79"/>
-        </w:rPr>
-        <w:t>—  Cada</w:t>
-      </w:r>
-      <w:proofErr w:type="gramEnd"/>
-      <w:r>
-        <w:rPr>
-          <w:b/>
-          <w:bCs/>
-          <w:color w:val="1F4E79"/>
-        </w:rPr>
-        <w:t xml:space="preserve"> </w:t>
-      </w:r>
-      <w:proofErr w:type="gramStart"/>
-      <w:r>
-        <w:rPr>
-          <w:b/>
-          <w:bCs/>
-          <w:color w:val="1F4E79"/>
-        </w:rPr>
-        <w:t>turma É</w:t>
-      </w:r>
-      <w:proofErr w:type="gramEnd"/>
-      <w:r>
-        <w:rPr>
-          <w:b/>
-          <w:bCs/>
-          <w:color w:val="1F4E79"/>
-        </w:rPr>
-        <w:t xml:space="preserve"> o time</w:t>
+        <w:t xml:space="preserve">  —  Cada turma É o time</w:t>
       </w:r>
     </w:p>
     <w:tbl>
@@ -841,12 +763,6 @@
         <w:gridCol w:w="3300"/>
       </w:tblGrid>
       <w:tr>
-        <w:tblPrEx>
-          <w:tblCellMar>
-            <w:top w:w="0" w:type="dxa"/>
-            <w:bottom w:w="0" w:type="dxa"/>
-          </w:tblCellMar>
-        </w:tblPrEx>
         <w:trPr>
           <w:tblHeader/>
         </w:trPr>
@@ -984,12 +900,6 @@
         </w:tc>
       </w:tr>
       <w:tr>
-        <w:tblPrEx>
-          <w:tblCellMar>
-            <w:top w:w="0" w:type="dxa"/>
-            <w:bottom w:w="0" w:type="dxa"/>
-          </w:tblCellMar>
-        </w:tblPrEx>
         <w:tc>
           <w:tcPr>
             <w:tcW w:w="2500" w:type="dxa"/>
@@ -1108,12 +1018,6 @@
         </w:tc>
       </w:tr>
       <w:tr>
-        <w:tblPrEx>
-          <w:tblCellMar>
-            <w:top w:w="0" w:type="dxa"/>
-            <w:bottom w:w="0" w:type="dxa"/>
-          </w:tblCellMar>
-        </w:tblPrEx>
         <w:tc>
           <w:tcPr>
             <w:tcW w:w="2500" w:type="dxa"/>
@@ -1232,12 +1136,6 @@
         </w:tc>
       </w:tr>
       <w:tr>
-        <w:tblPrEx>
-          <w:tblCellMar>
-            <w:top w:w="0" w:type="dxa"/>
-            <w:bottom w:w="0" w:type="dxa"/>
-          </w:tblCellMar>
-        </w:tblPrEx>
         <w:tc>
           <w:tcPr>
             <w:tcW w:w="2500" w:type="dxa"/>
@@ -1376,12 +1274,6 @@
         </w:tc>
       </w:tr>
       <w:tr>
-        <w:tblPrEx>
-          <w:tblCellMar>
-            <w:top w:w="0" w:type="dxa"/>
-            <w:bottom w:w="0" w:type="dxa"/>
-          </w:tblCellMar>
-        </w:tblPrEx>
         <w:tc>
           <w:tcPr>
             <w:tcW w:w="2500" w:type="dxa"/>
@@ -1500,12 +1392,6 @@
         </w:tc>
       </w:tr>
       <w:tr>
-        <w:tblPrEx>
-          <w:tblCellMar>
-            <w:top w:w="0" w:type="dxa"/>
-            <w:bottom w:w="0" w:type="dxa"/>
-          </w:tblCellMar>
-        </w:tblPrEx>
         <w:tc>
           <w:tcPr>
             <w:tcW w:w="2500" w:type="dxa"/>
@@ -1624,12 +1510,6 @@
         </w:tc>
       </w:tr>
       <w:tr>
-        <w:tblPrEx>
-          <w:tblCellMar>
-            <w:top w:w="0" w:type="dxa"/>
-            <w:bottom w:w="0" w:type="dxa"/>
-          </w:tblCellMar>
-        </w:tblPrEx>
         <w:tc>
           <w:tcPr>
             <w:tcW w:w="2500" w:type="dxa"/>
@@ -1801,25 +1681,7 @@
           <w:bCs/>
           <w:color w:val="1F4E79"/>
         </w:rPr>
-        <w:t xml:space="preserve">  </w:t>
-      </w:r>
-      <w:proofErr w:type="gramStart"/>
-      <w:r>
-        <w:rPr>
-          <w:b/>
-          <w:bCs/>
-          <w:color w:val="1F4E79"/>
-        </w:rPr>
-        <w:t>—  Alunos</w:t>
-      </w:r>
-      <w:proofErr w:type="gramEnd"/>
-      <w:r>
-        <w:rPr>
-          <w:b/>
-          <w:bCs/>
-          <w:color w:val="1F4E79"/>
-        </w:rPr>
-        <w:t xml:space="preserve"> e </w:t>
+        <w:t xml:space="preserve">  —  Alunos e </w:t>
       </w:r>
       <w:proofErr w:type="spellStart"/>
       <w:r>
@@ -1864,12 +1726,6 @@
         <w:gridCol w:w="3300"/>
       </w:tblGrid>
       <w:tr>
-        <w:tblPrEx>
-          <w:tblCellMar>
-            <w:top w:w="0" w:type="dxa"/>
-            <w:bottom w:w="0" w:type="dxa"/>
-          </w:tblCellMar>
-        </w:tblPrEx>
         <w:trPr>
           <w:tblHeader/>
         </w:trPr>
@@ -2007,12 +1863,6 @@
         </w:tc>
       </w:tr>
       <w:tr>
-        <w:tblPrEx>
-          <w:tblCellMar>
-            <w:top w:w="0" w:type="dxa"/>
-            <w:bottom w:w="0" w:type="dxa"/>
-          </w:tblCellMar>
-        </w:tblPrEx>
         <w:tc>
           <w:tcPr>
             <w:tcW w:w="2500" w:type="dxa"/>
@@ -2131,12 +1981,6 @@
         </w:tc>
       </w:tr>
       <w:tr>
-        <w:tblPrEx>
-          <w:tblCellMar>
-            <w:top w:w="0" w:type="dxa"/>
-            <w:bottom w:w="0" w:type="dxa"/>
-          </w:tblCellMar>
-        </w:tblPrEx>
         <w:tc>
           <w:tcPr>
             <w:tcW w:w="2500" w:type="dxa"/>
@@ -2255,12 +2099,6 @@
         </w:tc>
       </w:tr>
       <w:tr>
-        <w:tblPrEx>
-          <w:tblCellMar>
-            <w:top w:w="0" w:type="dxa"/>
-            <w:bottom w:w="0" w:type="dxa"/>
-          </w:tblCellMar>
-        </w:tblPrEx>
         <w:tc>
           <w:tcPr>
             <w:tcW w:w="2500" w:type="dxa"/>
@@ -2389,12 +2227,6 @@
         </w:tc>
       </w:tr>
       <w:tr>
-        <w:tblPrEx>
-          <w:tblCellMar>
-            <w:top w:w="0" w:type="dxa"/>
-            <w:bottom w:w="0" w:type="dxa"/>
-          </w:tblCellMar>
-        </w:tblPrEx>
         <w:tc>
           <w:tcPr>
             <w:tcW w:w="2500" w:type="dxa"/>
@@ -2524,12 +2356,6 @@
         </w:tc>
       </w:tr>
       <w:tr>
-        <w:tblPrEx>
-          <w:tblCellMar>
-            <w:top w:w="0" w:type="dxa"/>
-            <w:bottom w:w="0" w:type="dxa"/>
-          </w:tblCellMar>
-        </w:tblPrEx>
         <w:tc>
           <w:tcPr>
             <w:tcW w:w="2500" w:type="dxa"/>
@@ -2686,12 +2512,6 @@
         </w:tc>
       </w:tr>
       <w:tr>
-        <w:tblPrEx>
-          <w:tblCellMar>
-            <w:top w:w="0" w:type="dxa"/>
-            <w:bottom w:w="0" w:type="dxa"/>
-          </w:tblCellMar>
-        </w:tblPrEx>
         <w:tc>
           <w:tcPr>
             <w:tcW w:w="2500" w:type="dxa"/>
@@ -2820,12 +2640,6 @@
         </w:tc>
       </w:tr>
       <w:tr>
-        <w:tblPrEx>
-          <w:tblCellMar>
-            <w:top w:w="0" w:type="dxa"/>
-            <w:bottom w:w="0" w:type="dxa"/>
-          </w:tblCellMar>
-        </w:tblPrEx>
         <w:tc>
           <w:tcPr>
             <w:tcW w:w="2500" w:type="dxa"/>
@@ -2954,12 +2768,6 @@
         </w:tc>
       </w:tr>
       <w:tr>
-        <w:tblPrEx>
-          <w:tblCellMar>
-            <w:top w:w="0" w:type="dxa"/>
-            <w:bottom w:w="0" w:type="dxa"/>
-          </w:tblCellMar>
-        </w:tblPrEx>
         <w:tc>
           <w:tcPr>
             <w:tcW w:w="2500" w:type="dxa"/>
@@ -3088,12 +2896,6 @@
         </w:tc>
       </w:tr>
       <w:tr>
-        <w:tblPrEx>
-          <w:tblCellMar>
-            <w:top w:w="0" w:type="dxa"/>
-            <w:bottom w:w="0" w:type="dxa"/>
-          </w:tblCellMar>
-        </w:tblPrEx>
         <w:tc>
           <w:tcPr>
             <w:tcW w:w="2500" w:type="dxa"/>
@@ -3222,12 +3024,6 @@
         </w:tc>
       </w:tr>
       <w:tr>
-        <w:tblPrEx>
-          <w:tblCellMar>
-            <w:top w:w="0" w:type="dxa"/>
-            <w:bottom w:w="0" w:type="dxa"/>
-          </w:tblCellMar>
-        </w:tblPrEx>
         <w:tc>
           <w:tcPr>
             <w:tcW w:w="2500" w:type="dxa"/>
@@ -3346,12 +3142,6 @@
         </w:tc>
       </w:tr>
       <w:tr>
-        <w:tblPrEx>
-          <w:tblCellMar>
-            <w:top w:w="0" w:type="dxa"/>
-            <w:bottom w:w="0" w:type="dxa"/>
-          </w:tblCellMar>
-        </w:tblPrEx>
         <w:tc>
           <w:tcPr>
             <w:tcW w:w="2500" w:type="dxa"/>
@@ -3498,12 +3288,6 @@
         </w:tc>
       </w:tr>
       <w:tr>
-        <w:tblPrEx>
-          <w:tblCellMar>
-            <w:top w:w="0" w:type="dxa"/>
-            <w:bottom w:w="0" w:type="dxa"/>
-          </w:tblCellMar>
-        </w:tblPrEx>
         <w:tc>
           <w:tcPr>
             <w:tcW w:w="2500" w:type="dxa"/>
@@ -3632,12 +3416,6 @@
         </w:tc>
       </w:tr>
       <w:tr>
-        <w:tblPrEx>
-          <w:tblCellMar>
-            <w:top w:w="0" w:type="dxa"/>
-            <w:bottom w:w="0" w:type="dxa"/>
-          </w:tblCellMar>
-        </w:tblPrEx>
         <w:tc>
           <w:tcPr>
             <w:tcW w:w="2500" w:type="dxa"/>
@@ -3791,25 +3569,7 @@
           <w:bCs/>
           <w:color w:val="1F4E79"/>
         </w:rPr>
-        <w:t xml:space="preserve">  </w:t>
-      </w:r>
-      <w:proofErr w:type="gramStart"/>
-      <w:r>
-        <w:rPr>
-          <w:b/>
-          <w:bCs/>
-          <w:color w:val="1F4E79"/>
-        </w:rPr>
-        <w:t>—  Esportes</w:t>
-      </w:r>
-      <w:proofErr w:type="gramEnd"/>
-      <w:r>
-        <w:rPr>
-          <w:b/>
-          <w:bCs/>
-          <w:color w:val="1F4E79"/>
-        </w:rPr>
-        <w:t xml:space="preserve"> configuráveis pelo ADM geral</w:t>
+        <w:t xml:space="preserve">  —  Esportes configuráveis pelo ADM geral</w:t>
       </w:r>
     </w:p>
     <w:tbl>
@@ -3836,12 +3596,6 @@
         <w:gridCol w:w="3300"/>
       </w:tblGrid>
       <w:tr>
-        <w:tblPrEx>
-          <w:tblCellMar>
-            <w:top w:w="0" w:type="dxa"/>
-            <w:bottom w:w="0" w:type="dxa"/>
-          </w:tblCellMar>
-        </w:tblPrEx>
         <w:trPr>
           <w:tblHeader/>
         </w:trPr>
@@ -3979,12 +3733,6 @@
         </w:tc>
       </w:tr>
       <w:tr>
-        <w:tblPrEx>
-          <w:tblCellMar>
-            <w:top w:w="0" w:type="dxa"/>
-            <w:bottom w:w="0" w:type="dxa"/>
-          </w:tblCellMar>
-        </w:tblPrEx>
         <w:tc>
           <w:tcPr>
             <w:tcW w:w="2500" w:type="dxa"/>
@@ -4103,12 +3851,6 @@
         </w:tc>
       </w:tr>
       <w:tr>
-        <w:tblPrEx>
-          <w:tblCellMar>
-            <w:top w:w="0" w:type="dxa"/>
-            <w:bottom w:w="0" w:type="dxa"/>
-          </w:tblCellMar>
-        </w:tblPrEx>
         <w:tc>
           <w:tcPr>
             <w:tcW w:w="2500" w:type="dxa"/>
@@ -4257,12 +3999,6 @@
         </w:tc>
       </w:tr>
       <w:tr>
-        <w:tblPrEx>
-          <w:tblCellMar>
-            <w:top w:w="0" w:type="dxa"/>
-            <w:bottom w:w="0" w:type="dxa"/>
-          </w:tblCellMar>
-        </w:tblPrEx>
         <w:tc>
           <w:tcPr>
             <w:tcW w:w="2500" w:type="dxa"/>
@@ -4391,12 +4127,6 @@
         </w:tc>
       </w:tr>
       <w:tr>
-        <w:tblPrEx>
-          <w:tblCellMar>
-            <w:top w:w="0" w:type="dxa"/>
-            <w:bottom w:w="0" w:type="dxa"/>
-          </w:tblCellMar>
-        </w:tblPrEx>
         <w:tc>
           <w:tcPr>
             <w:tcW w:w="2500" w:type="dxa"/>
@@ -4515,12 +4245,6 @@
         </w:tc>
       </w:tr>
       <w:tr>
-        <w:tblPrEx>
-          <w:tblCellMar>
-            <w:top w:w="0" w:type="dxa"/>
-            <w:bottom w:w="0" w:type="dxa"/>
-          </w:tblCellMar>
-        </w:tblPrEx>
         <w:tc>
           <w:tcPr>
             <w:tcW w:w="2500" w:type="dxa"/>
@@ -4677,12 +4401,6 @@
         </w:tc>
       </w:tr>
       <w:tr>
-        <w:tblPrEx>
-          <w:tblCellMar>
-            <w:top w:w="0" w:type="dxa"/>
-            <w:bottom w:w="0" w:type="dxa"/>
-          </w:tblCellMar>
-        </w:tblPrEx>
         <w:tc>
           <w:tcPr>
             <w:tcW w:w="2500" w:type="dxa"/>
@@ -4801,12 +4519,6 @@
         </w:tc>
       </w:tr>
       <w:tr>
-        <w:tblPrEx>
-          <w:tblCellMar>
-            <w:top w:w="0" w:type="dxa"/>
-            <w:bottom w:w="0" w:type="dxa"/>
-          </w:tblCellMar>
-        </w:tblPrEx>
         <w:tc>
           <w:tcPr>
             <w:tcW w:w="2500" w:type="dxa"/>
@@ -4935,12 +4647,6 @@
         </w:tc>
       </w:tr>
       <w:tr>
-        <w:tblPrEx>
-          <w:tblCellMar>
-            <w:top w:w="0" w:type="dxa"/>
-            <w:bottom w:w="0" w:type="dxa"/>
-          </w:tblCellMar>
-        </w:tblPrEx>
         <w:tc>
           <w:tcPr>
             <w:tcW w:w="2500" w:type="dxa"/>
@@ -5069,12 +4775,6 @@
         </w:tc>
       </w:tr>
       <w:tr>
-        <w:tblPrEx>
-          <w:tblCellMar>
-            <w:top w:w="0" w:type="dxa"/>
-            <w:bottom w:w="0" w:type="dxa"/>
-          </w:tblCellMar>
-        </w:tblPrEx>
         <w:tc>
           <w:tcPr>
             <w:tcW w:w="2500" w:type="dxa"/>
@@ -5228,25 +4928,7 @@
           <w:bCs/>
           <w:color w:val="1F4E79"/>
         </w:rPr>
-        <w:t xml:space="preserve">  </w:t>
-      </w:r>
-      <w:proofErr w:type="gramStart"/>
-      <w:r>
-        <w:rPr>
-          <w:b/>
-          <w:bCs/>
-          <w:color w:val="1F4E79"/>
-        </w:rPr>
-        <w:t>—  Cada</w:t>
-      </w:r>
-      <w:proofErr w:type="gramEnd"/>
-      <w:r>
-        <w:rPr>
-          <w:b/>
-          <w:bCs/>
-          <w:color w:val="1F4E79"/>
-        </w:rPr>
-        <w:t xml:space="preserve"> edição/ano do interclasse</w:t>
+        <w:t xml:space="preserve">  —  Cada edição/ano do interclasse</w:t>
       </w:r>
     </w:p>
     <w:tbl>
@@ -5273,12 +4955,6 @@
         <w:gridCol w:w="3300"/>
       </w:tblGrid>
       <w:tr>
-        <w:tblPrEx>
-          <w:tblCellMar>
-            <w:top w:w="0" w:type="dxa"/>
-            <w:bottom w:w="0" w:type="dxa"/>
-          </w:tblCellMar>
-        </w:tblPrEx>
         <w:trPr>
           <w:tblHeader/>
         </w:trPr>
@@ -5416,12 +5092,6 @@
         </w:tc>
       </w:tr>
       <w:tr>
-        <w:tblPrEx>
-          <w:tblCellMar>
-            <w:top w:w="0" w:type="dxa"/>
-            <w:bottom w:w="0" w:type="dxa"/>
-          </w:tblCellMar>
-        </w:tblPrEx>
         <w:tc>
           <w:tcPr>
             <w:tcW w:w="2500" w:type="dxa"/>
@@ -5540,12 +5210,6 @@
         </w:tc>
       </w:tr>
       <w:tr>
-        <w:tblPrEx>
-          <w:tblCellMar>
-            <w:top w:w="0" w:type="dxa"/>
-            <w:bottom w:w="0" w:type="dxa"/>
-          </w:tblCellMar>
-        </w:tblPrEx>
         <w:tc>
           <w:tcPr>
             <w:tcW w:w="2500" w:type="dxa"/>
@@ -5684,12 +5348,6 @@
         </w:tc>
       </w:tr>
       <w:tr>
-        <w:tblPrEx>
-          <w:tblCellMar>
-            <w:top w:w="0" w:type="dxa"/>
-            <w:bottom w:w="0" w:type="dxa"/>
-          </w:tblCellMar>
-        </w:tblPrEx>
         <w:tc>
           <w:tcPr>
             <w:tcW w:w="2500" w:type="dxa"/>
@@ -5808,12 +5466,6 @@
         </w:tc>
       </w:tr>
       <w:tr>
-        <w:tblPrEx>
-          <w:tblCellMar>
-            <w:top w:w="0" w:type="dxa"/>
-            <w:bottom w:w="0" w:type="dxa"/>
-          </w:tblCellMar>
-        </w:tblPrEx>
         <w:tc>
           <w:tcPr>
             <w:tcW w:w="2500" w:type="dxa"/>
@@ -5932,12 +5584,6 @@
         </w:tc>
       </w:tr>
       <w:tr>
-        <w:tblPrEx>
-          <w:tblCellMar>
-            <w:top w:w="0" w:type="dxa"/>
-            <w:bottom w:w="0" w:type="dxa"/>
-          </w:tblCellMar>
-        </w:tblPrEx>
         <w:tc>
           <w:tcPr>
             <w:tcW w:w="2500" w:type="dxa"/>
@@ -6056,12 +5702,6 @@
         </w:tc>
       </w:tr>
       <w:tr>
-        <w:tblPrEx>
-          <w:tblCellMar>
-            <w:top w:w="0" w:type="dxa"/>
-            <w:bottom w:w="0" w:type="dxa"/>
-          </w:tblCellMar>
-        </w:tblPrEx>
         <w:tc>
           <w:tcPr>
             <w:tcW w:w="2500" w:type="dxa"/>
@@ -6216,12 +5856,6 @@
         </w:tc>
       </w:tr>
       <w:tr>
-        <w:tblPrEx>
-          <w:tblCellMar>
-            <w:top w:w="0" w:type="dxa"/>
-            <w:bottom w:w="0" w:type="dxa"/>
-          </w:tblCellMar>
-        </w:tblPrEx>
         <w:tc>
           <w:tcPr>
             <w:tcW w:w="2500" w:type="dxa"/>
@@ -6376,25 +6010,7 @@
           <w:bCs/>
           <w:color w:val="1F4E79"/>
         </w:rPr>
-        <w:t>_</w:t>
-      </w:r>
-      <w:proofErr w:type="gramStart"/>
-      <w:r>
-        <w:rPr>
-          <w:b/>
-          <w:bCs/>
-          <w:color w:val="1F4E79"/>
-        </w:rPr>
-        <w:t>MODALIDADE  —</w:t>
-      </w:r>
-      <w:proofErr w:type="gramEnd"/>
-      <w:r>
-        <w:rPr>
-          <w:b/>
-          <w:bCs/>
-          <w:color w:val="1F4E79"/>
-        </w:rPr>
-        <w:t xml:space="preserve">  Quais esportes estão em cada edição</w:t>
+        <w:t>_MODALIDADE  —  Quais esportes estão em cada edição</w:t>
       </w:r>
     </w:p>
     <w:tbl>
@@ -6421,12 +6037,6 @@
         <w:gridCol w:w="3300"/>
       </w:tblGrid>
       <w:tr>
-        <w:tblPrEx>
-          <w:tblCellMar>
-            <w:top w:w="0" w:type="dxa"/>
-            <w:bottom w:w="0" w:type="dxa"/>
-          </w:tblCellMar>
-        </w:tblPrEx>
         <w:trPr>
           <w:tblHeader/>
         </w:trPr>
@@ -6564,12 +6174,6 @@
         </w:tc>
       </w:tr>
       <w:tr>
-        <w:tblPrEx>
-          <w:tblCellMar>
-            <w:top w:w="0" w:type="dxa"/>
-            <w:bottom w:w="0" w:type="dxa"/>
-          </w:tblCellMar>
-        </w:tblPrEx>
         <w:tc>
           <w:tcPr>
             <w:tcW w:w="2500" w:type="dxa"/>
@@ -6688,12 +6292,6 @@
         </w:tc>
       </w:tr>
       <w:tr>
-        <w:tblPrEx>
-          <w:tblCellMar>
-            <w:top w:w="0" w:type="dxa"/>
-            <w:bottom w:w="0" w:type="dxa"/>
-          </w:tblCellMar>
-        </w:tblPrEx>
         <w:tc>
           <w:tcPr>
             <w:tcW w:w="2500" w:type="dxa"/>
@@ -6822,12 +6420,6 @@
         </w:tc>
       </w:tr>
       <w:tr>
-        <w:tblPrEx>
-          <w:tblCellMar>
-            <w:top w:w="0" w:type="dxa"/>
-            <w:bottom w:w="0" w:type="dxa"/>
-          </w:tblCellMar>
-        </w:tblPrEx>
         <w:tc>
           <w:tcPr>
             <w:tcW w:w="2500" w:type="dxa"/>
@@ -6956,12 +6548,6 @@
         </w:tc>
       </w:tr>
       <w:tr>
-        <w:tblPrEx>
-          <w:tblCellMar>
-            <w:top w:w="0" w:type="dxa"/>
-            <w:bottom w:w="0" w:type="dxa"/>
-          </w:tblCellMar>
-        </w:tblPrEx>
         <w:tc>
           <w:tcPr>
             <w:tcW w:w="2500" w:type="dxa"/>
@@ -7108,12 +6694,6 @@
         </w:tc>
       </w:tr>
       <w:tr>
-        <w:tblPrEx>
-          <w:tblCellMar>
-            <w:top w:w="0" w:type="dxa"/>
-            <w:bottom w:w="0" w:type="dxa"/>
-          </w:tblCellMar>
-        </w:tblPrEx>
         <w:tc>
           <w:tcPr>
             <w:tcW w:w="2500" w:type="dxa"/>
@@ -7242,12 +6822,6 @@
         </w:tc>
       </w:tr>
       <w:tr>
-        <w:tblPrEx>
-          <w:tblCellMar>
-            <w:top w:w="0" w:type="dxa"/>
-            <w:bottom w:w="0" w:type="dxa"/>
-          </w:tblCellMar>
-        </w:tblPrEx>
         <w:tc>
           <w:tcPr>
             <w:tcW w:w="2500" w:type="dxa"/>
@@ -7429,25 +7003,7 @@
           <w:bCs/>
           <w:color w:val="1F4E79"/>
         </w:rPr>
-        <w:t xml:space="preserve">  </w:t>
-      </w:r>
-      <w:proofErr w:type="gramStart"/>
-      <w:r>
-        <w:rPr>
-          <w:b/>
-          <w:bCs/>
-          <w:color w:val="1F4E79"/>
-        </w:rPr>
-        <w:t>—  Aluno</w:t>
-      </w:r>
-      <w:proofErr w:type="gramEnd"/>
-      <w:r>
-        <w:rPr>
-          <w:b/>
-          <w:bCs/>
-          <w:color w:val="1F4E79"/>
-        </w:rPr>
-        <w:t xml:space="preserve"> se inscreve em uma modalidade da edição</w:t>
+        <w:t xml:space="preserve">  —  Aluno se inscreve em uma modalidade da edição</w:t>
       </w:r>
     </w:p>
     <w:tbl>
@@ -7474,12 +7030,6 @@
         <w:gridCol w:w="3054"/>
       </w:tblGrid>
       <w:tr>
-        <w:tblPrEx>
-          <w:tblCellMar>
-            <w:top w:w="0" w:type="dxa"/>
-            <w:bottom w:w="0" w:type="dxa"/>
-          </w:tblCellMar>
-        </w:tblPrEx>
         <w:trPr>
           <w:tblHeader/>
         </w:trPr>
@@ -7617,12 +7167,6 @@
         </w:tc>
       </w:tr>
       <w:tr>
-        <w:tblPrEx>
-          <w:tblCellMar>
-            <w:top w:w="0" w:type="dxa"/>
-            <w:bottom w:w="0" w:type="dxa"/>
-          </w:tblCellMar>
-        </w:tblPrEx>
         <w:tc>
           <w:tcPr>
             <w:tcW w:w="2500" w:type="dxa"/>
@@ -7741,12 +7285,6 @@
         </w:tc>
       </w:tr>
       <w:tr>
-        <w:tblPrEx>
-          <w:tblCellMar>
-            <w:top w:w="0" w:type="dxa"/>
-            <w:bottom w:w="0" w:type="dxa"/>
-          </w:tblCellMar>
-        </w:tblPrEx>
         <w:tc>
           <w:tcPr>
             <w:tcW w:w="2500" w:type="dxa"/>
@@ -7865,12 +7403,6 @@
         </w:tc>
       </w:tr>
       <w:tr>
-        <w:tblPrEx>
-          <w:tblCellMar>
-            <w:top w:w="0" w:type="dxa"/>
-            <w:bottom w:w="0" w:type="dxa"/>
-          </w:tblCellMar>
-        </w:tblPrEx>
         <w:tc>
           <w:tcPr>
             <w:tcW w:w="2500" w:type="dxa"/>
@@ -7999,12 +7531,6 @@
         </w:tc>
       </w:tr>
       <w:tr>
-        <w:tblPrEx>
-          <w:tblCellMar>
-            <w:top w:w="0" w:type="dxa"/>
-            <w:bottom w:w="0" w:type="dxa"/>
-          </w:tblCellMar>
-        </w:tblPrEx>
         <w:tc>
           <w:tcPr>
             <w:tcW w:w="2500" w:type="dxa"/>
@@ -8133,12 +7659,6 @@
         </w:tc>
       </w:tr>
       <w:tr>
-        <w:tblPrEx>
-          <w:tblCellMar>
-            <w:top w:w="0" w:type="dxa"/>
-            <w:bottom w:w="0" w:type="dxa"/>
-          </w:tblCellMar>
-        </w:tblPrEx>
         <w:tc>
           <w:tcPr>
             <w:tcW w:w="2500" w:type="dxa"/>
@@ -8287,12 +7807,6 @@
         </w:tc>
       </w:tr>
       <w:tr>
-        <w:tblPrEx>
-          <w:tblCellMar>
-            <w:top w:w="0" w:type="dxa"/>
-            <w:bottom w:w="0" w:type="dxa"/>
-          </w:tblCellMar>
-        </w:tblPrEx>
         <w:tc>
           <w:tcPr>
             <w:tcW w:w="2500" w:type="dxa"/>
@@ -8439,12 +7953,6 @@
         </w:tc>
       </w:tr>
       <w:tr>
-        <w:tblPrEx>
-          <w:tblCellMar>
-            <w:top w:w="0" w:type="dxa"/>
-            <w:bottom w:w="0" w:type="dxa"/>
-          </w:tblCellMar>
-        </w:tblPrEx>
         <w:tc>
           <w:tcPr>
             <w:tcW w:w="2500" w:type="dxa"/>
@@ -8591,12 +8099,6 @@
         </w:tc>
       </w:tr>
       <w:tr>
-        <w:tblPrEx>
-          <w:tblCellMar>
-            <w:top w:w="0" w:type="dxa"/>
-            <w:bottom w:w="0" w:type="dxa"/>
-          </w:tblCellMar>
-        </w:tblPrEx>
         <w:tc>
           <w:tcPr>
             <w:tcW w:w="2500" w:type="dxa"/>
@@ -8740,25 +8242,7 @@
           <w:bCs/>
           <w:color w:val="1F4E79"/>
         </w:rPr>
-        <w:t xml:space="preserve">  </w:t>
-      </w:r>
-      <w:proofErr w:type="gramStart"/>
-      <w:r>
-        <w:rPr>
-          <w:b/>
-          <w:bCs/>
-          <w:color w:val="1F4E79"/>
-        </w:rPr>
-        <w:t>—  Jogo</w:t>
-      </w:r>
-      <w:proofErr w:type="gramEnd"/>
-      <w:r>
-        <w:rPr>
-          <w:b/>
-          <w:bCs/>
-          <w:color w:val="1F4E79"/>
-        </w:rPr>
-        <w:t xml:space="preserve"> entre duas turmas</w:t>
+        <w:t xml:space="preserve">  —  Jogo entre duas turmas</w:t>
       </w:r>
     </w:p>
     <w:tbl>
@@ -8785,12 +8269,6 @@
         <w:gridCol w:w="3076"/>
       </w:tblGrid>
       <w:tr>
-        <w:tblPrEx>
-          <w:tblCellMar>
-            <w:top w:w="0" w:type="dxa"/>
-            <w:bottom w:w="0" w:type="dxa"/>
-          </w:tblCellMar>
-        </w:tblPrEx>
         <w:trPr>
           <w:tblHeader/>
         </w:trPr>
@@ -8928,12 +8406,6 @@
         </w:tc>
       </w:tr>
       <w:tr>
-        <w:tblPrEx>
-          <w:tblCellMar>
-            <w:top w:w="0" w:type="dxa"/>
-            <w:bottom w:w="0" w:type="dxa"/>
-          </w:tblCellMar>
-        </w:tblPrEx>
         <w:tc>
           <w:tcPr>
             <w:tcW w:w="2500" w:type="dxa"/>
@@ -9052,12 +8524,6 @@
         </w:tc>
       </w:tr>
       <w:tr>
-        <w:tblPrEx>
-          <w:tblCellMar>
-            <w:top w:w="0" w:type="dxa"/>
-            <w:bottom w:w="0" w:type="dxa"/>
-          </w:tblCellMar>
-        </w:tblPrEx>
         <w:tc>
           <w:tcPr>
             <w:tcW w:w="2500" w:type="dxa"/>
@@ -9186,12 +8652,6 @@
         </w:tc>
       </w:tr>
       <w:tr>
-        <w:tblPrEx>
-          <w:tblCellMar>
-            <w:top w:w="0" w:type="dxa"/>
-            <w:bottom w:w="0" w:type="dxa"/>
-          </w:tblCellMar>
-        </w:tblPrEx>
         <w:tc>
           <w:tcPr>
             <w:tcW w:w="2500" w:type="dxa"/>
@@ -9310,12 +8770,6 @@
         </w:tc>
       </w:tr>
       <w:tr>
-        <w:tblPrEx>
-          <w:tblCellMar>
-            <w:top w:w="0" w:type="dxa"/>
-            <w:bottom w:w="0" w:type="dxa"/>
-          </w:tblCellMar>
-        </w:tblPrEx>
         <w:tc>
           <w:tcPr>
             <w:tcW w:w="2500" w:type="dxa"/>
@@ -9434,12 +8888,6 @@
         </w:tc>
       </w:tr>
       <w:tr>
-        <w:tblPrEx>
-          <w:tblCellMar>
-            <w:top w:w="0" w:type="dxa"/>
-            <w:bottom w:w="0" w:type="dxa"/>
-          </w:tblCellMar>
-        </w:tblPrEx>
         <w:tc>
           <w:tcPr>
             <w:tcW w:w="2500" w:type="dxa"/>
@@ -9558,12 +9006,6 @@
         </w:tc>
       </w:tr>
       <w:tr>
-        <w:tblPrEx>
-          <w:tblCellMar>
-            <w:top w:w="0" w:type="dxa"/>
-            <w:bottom w:w="0" w:type="dxa"/>
-          </w:tblCellMar>
-        </w:tblPrEx>
         <w:tc>
           <w:tcPr>
             <w:tcW w:w="2500" w:type="dxa"/>
@@ -9692,12 +9134,6 @@
         </w:tc>
       </w:tr>
       <w:tr>
-        <w:tblPrEx>
-          <w:tblCellMar>
-            <w:top w:w="0" w:type="dxa"/>
-            <w:bottom w:w="0" w:type="dxa"/>
-          </w:tblCellMar>
-        </w:tblPrEx>
         <w:tc>
           <w:tcPr>
             <w:tcW w:w="2500" w:type="dxa"/>
@@ -9826,12 +9262,6 @@
         </w:tc>
       </w:tr>
       <w:tr>
-        <w:tblPrEx>
-          <w:tblCellMar>
-            <w:top w:w="0" w:type="dxa"/>
-            <w:bottom w:w="0" w:type="dxa"/>
-          </w:tblCellMar>
-        </w:tblPrEx>
         <w:tc>
           <w:tcPr>
             <w:tcW w:w="2500" w:type="dxa"/>
@@ -9978,12 +9408,6 @@
         </w:tc>
       </w:tr>
       <w:tr>
-        <w:tblPrEx>
-          <w:tblCellMar>
-            <w:top w:w="0" w:type="dxa"/>
-            <w:bottom w:w="0" w:type="dxa"/>
-          </w:tblCellMar>
-        </w:tblPrEx>
         <w:tc>
           <w:tcPr>
             <w:tcW w:w="2500" w:type="dxa"/>
@@ -10113,12 +9537,6 @@
         </w:tc>
       </w:tr>
       <w:tr>
-        <w:tblPrEx>
-          <w:tblCellMar>
-            <w:top w:w="0" w:type="dxa"/>
-            <w:bottom w:w="0" w:type="dxa"/>
-          </w:tblCellMar>
-        </w:tblPrEx>
         <w:tc>
           <w:tcPr>
             <w:tcW w:w="2500" w:type="dxa"/>
@@ -10247,12 +9665,6 @@
         </w:tc>
       </w:tr>
       <w:tr>
-        <w:tblPrEx>
-          <w:tblCellMar>
-            <w:top w:w="0" w:type="dxa"/>
-            <w:bottom w:w="0" w:type="dxa"/>
-          </w:tblCellMar>
-        </w:tblPrEx>
         <w:tc>
           <w:tcPr>
             <w:tcW w:w="2500" w:type="dxa"/>
@@ -10406,25 +9818,7 @@
           <w:bCs/>
           <w:color w:val="1F4E79"/>
         </w:rPr>
-        <w:t xml:space="preserve">  </w:t>
-      </w:r>
-      <w:proofErr w:type="gramStart"/>
-      <w:r>
-        <w:rPr>
-          <w:b/>
-          <w:bCs/>
-          <w:color w:val="1F4E79"/>
-        </w:rPr>
-        <w:t>—  Placar</w:t>
-      </w:r>
-      <w:proofErr w:type="gramEnd"/>
-      <w:r>
-        <w:rPr>
-          <w:b/>
-          <w:bCs/>
-          <w:color w:val="1F4E79"/>
-        </w:rPr>
-        <w:t xml:space="preserve"> de cada partida (1:1 com PARTIDA)</w:t>
+        <w:t xml:space="preserve">  —  Placar de cada partida (1:1 com PARTIDA)</w:t>
       </w:r>
     </w:p>
     <w:tbl>
@@ -10451,12 +9845,6 @@
         <w:gridCol w:w="3300"/>
       </w:tblGrid>
       <w:tr>
-        <w:tblPrEx>
-          <w:tblCellMar>
-            <w:top w:w="0" w:type="dxa"/>
-            <w:bottom w:w="0" w:type="dxa"/>
-          </w:tblCellMar>
-        </w:tblPrEx>
         <w:trPr>
           <w:tblHeader/>
         </w:trPr>
@@ -10594,12 +9982,6 @@
         </w:tc>
       </w:tr>
       <w:tr>
-        <w:tblPrEx>
-          <w:tblCellMar>
-            <w:top w:w="0" w:type="dxa"/>
-            <w:bottom w:w="0" w:type="dxa"/>
-          </w:tblCellMar>
-        </w:tblPrEx>
         <w:tc>
           <w:tcPr>
             <w:tcW w:w="2500" w:type="dxa"/>
@@ -10718,12 +10100,6 @@
         </w:tc>
       </w:tr>
       <w:tr>
-        <w:tblPrEx>
-          <w:tblCellMar>
-            <w:top w:w="0" w:type="dxa"/>
-            <w:bottom w:w="0" w:type="dxa"/>
-          </w:tblCellMar>
-        </w:tblPrEx>
         <w:tc>
           <w:tcPr>
             <w:tcW w:w="2500" w:type="dxa"/>
@@ -10842,12 +10218,6 @@
         </w:tc>
       </w:tr>
       <w:tr>
-        <w:tblPrEx>
-          <w:tblCellMar>
-            <w:top w:w="0" w:type="dxa"/>
-            <w:bottom w:w="0" w:type="dxa"/>
-          </w:tblCellMar>
-        </w:tblPrEx>
         <w:tc>
           <w:tcPr>
             <w:tcW w:w="2500" w:type="dxa"/>
@@ -10966,12 +10336,6 @@
         </w:tc>
       </w:tr>
       <w:tr>
-        <w:tblPrEx>
-          <w:tblCellMar>
-            <w:top w:w="0" w:type="dxa"/>
-            <w:bottom w:w="0" w:type="dxa"/>
-          </w:tblCellMar>
-        </w:tblPrEx>
         <w:tc>
           <w:tcPr>
             <w:tcW w:w="2500" w:type="dxa"/>
@@ -11090,12 +10454,6 @@
         </w:tc>
       </w:tr>
       <w:tr>
-        <w:tblPrEx>
-          <w:tblCellMar>
-            <w:top w:w="0" w:type="dxa"/>
-            <w:bottom w:w="0" w:type="dxa"/>
-          </w:tblCellMar>
-        </w:tblPrEx>
         <w:tc>
           <w:tcPr>
             <w:tcW w:w="2500" w:type="dxa"/>
@@ -11214,12 +10572,6 @@
         </w:tc>
       </w:tr>
       <w:tr>
-        <w:tblPrEx>
-          <w:tblCellMar>
-            <w:top w:w="0" w:type="dxa"/>
-            <w:bottom w:w="0" w:type="dxa"/>
-          </w:tblCellMar>
-        </w:tblPrEx>
         <w:tc>
           <w:tcPr>
             <w:tcW w:w="2500" w:type="dxa"/>
@@ -11373,25 +10725,7 @@
           <w:bCs/>
           <w:color w:val="1F4E79"/>
         </w:rPr>
-        <w:t xml:space="preserve">  </w:t>
-      </w:r>
-      <w:proofErr w:type="gramStart"/>
-      <w:r>
-        <w:rPr>
-          <w:b/>
-          <w:bCs/>
-          <w:color w:val="1F4E79"/>
-        </w:rPr>
-        <w:t>—  Arquivo</w:t>
-      </w:r>
-      <w:proofErr w:type="gramEnd"/>
-      <w:r>
-        <w:rPr>
-          <w:b/>
-          <w:bCs/>
-          <w:color w:val="1F4E79"/>
-        </w:rPr>
-        <w:t xml:space="preserve"> enviado pelo ADM da sala após o jogo</w:t>
+        <w:t xml:space="preserve">  —  Arquivo enviado pelo ADM da sala após o jogo</w:t>
       </w:r>
     </w:p>
     <w:tbl>
@@ -11418,12 +10752,6 @@
         <w:gridCol w:w="3300"/>
       </w:tblGrid>
       <w:tr>
-        <w:tblPrEx>
-          <w:tblCellMar>
-            <w:top w:w="0" w:type="dxa"/>
-            <w:bottom w:w="0" w:type="dxa"/>
-          </w:tblCellMar>
-        </w:tblPrEx>
         <w:trPr>
           <w:tblHeader/>
         </w:trPr>
@@ -11561,12 +10889,6 @@
         </w:tc>
       </w:tr>
       <w:tr>
-        <w:tblPrEx>
-          <w:tblCellMar>
-            <w:top w:w="0" w:type="dxa"/>
-            <w:bottom w:w="0" w:type="dxa"/>
-          </w:tblCellMar>
-        </w:tblPrEx>
         <w:tc>
           <w:tcPr>
             <w:tcW w:w="2500" w:type="dxa"/>
@@ -11685,12 +11007,6 @@
         </w:tc>
       </w:tr>
       <w:tr>
-        <w:tblPrEx>
-          <w:tblCellMar>
-            <w:top w:w="0" w:type="dxa"/>
-            <w:bottom w:w="0" w:type="dxa"/>
-          </w:tblCellMar>
-        </w:tblPrEx>
         <w:tc>
           <w:tcPr>
             <w:tcW w:w="2500" w:type="dxa"/>
@@ -11809,12 +11125,6 @@
         </w:tc>
       </w:tr>
       <w:tr>
-        <w:tblPrEx>
-          <w:tblCellMar>
-            <w:top w:w="0" w:type="dxa"/>
-            <w:bottom w:w="0" w:type="dxa"/>
-          </w:tblCellMar>
-        </w:tblPrEx>
         <w:tc>
           <w:tcPr>
             <w:tcW w:w="2500" w:type="dxa"/>
@@ -11933,12 +11243,6 @@
         </w:tc>
       </w:tr>
       <w:tr>
-        <w:tblPrEx>
-          <w:tblCellMar>
-            <w:top w:w="0" w:type="dxa"/>
-            <w:bottom w:w="0" w:type="dxa"/>
-          </w:tblCellMar>
-        </w:tblPrEx>
         <w:tc>
           <w:tcPr>
             <w:tcW w:w="2500" w:type="dxa"/>
@@ -12067,12 +11371,6 @@
         </w:tc>
       </w:tr>
       <w:tr>
-        <w:tblPrEx>
-          <w:tblCellMar>
-            <w:top w:w="0" w:type="dxa"/>
-            <w:bottom w:w="0" w:type="dxa"/>
-          </w:tblCellMar>
-        </w:tblPrEx>
         <w:tc>
           <w:tcPr>
             <w:tcW w:w="2500" w:type="dxa"/>
@@ -12201,12 +11499,6 @@
         </w:tc>
       </w:tr>
       <w:tr>
-        <w:tblPrEx>
-          <w:tblCellMar>
-            <w:top w:w="0" w:type="dxa"/>
-            <w:bottom w:w="0" w:type="dxa"/>
-          </w:tblCellMar>
-        </w:tblPrEx>
         <w:tc>
           <w:tcPr>
             <w:tcW w:w="2500" w:type="dxa"/>
@@ -12373,12 +11665,6 @@
         </w:tc>
       </w:tr>
       <w:tr>
-        <w:tblPrEx>
-          <w:tblCellMar>
-            <w:top w:w="0" w:type="dxa"/>
-            <w:bottom w:w="0" w:type="dxa"/>
-          </w:tblCellMar>
-        </w:tblPrEx>
         <w:tc>
           <w:tcPr>
             <w:tcW w:w="2500" w:type="dxa"/>
@@ -12515,12 +11801,6 @@
         </w:tc>
       </w:tr>
       <w:tr>
-        <w:tblPrEx>
-          <w:tblCellMar>
-            <w:top w:w="0" w:type="dxa"/>
-            <w:bottom w:w="0" w:type="dxa"/>
-          </w:tblCellMar>
-        </w:tblPrEx>
         <w:tc>
           <w:tcPr>
             <w:tcW w:w="2500" w:type="dxa"/>
@@ -12664,25 +11944,7 @@
           <w:bCs/>
           <w:color w:val="1F4E79"/>
         </w:rPr>
-        <w:t xml:space="preserve">  </w:t>
-      </w:r>
-      <w:proofErr w:type="gramStart"/>
-      <w:r>
-        <w:rPr>
-          <w:b/>
-          <w:bCs/>
-          <w:color w:val="1F4E79"/>
-        </w:rPr>
-        <w:t>—  Tabela</w:t>
-      </w:r>
-      <w:proofErr w:type="gramEnd"/>
-      <w:r>
-        <w:rPr>
-          <w:b/>
-          <w:bCs/>
-          <w:color w:val="1F4E79"/>
-        </w:rPr>
-        <w:t xml:space="preserve"> de pontos por turma e modalidade</w:t>
+        <w:t xml:space="preserve">  —  Tabela de pontos por turma e modalidade</w:t>
       </w:r>
     </w:p>
     <w:tbl>
@@ -12709,12 +11971,6 @@
         <w:gridCol w:w="3128"/>
       </w:tblGrid>
       <w:tr>
-        <w:tblPrEx>
-          <w:tblCellMar>
-            <w:top w:w="0" w:type="dxa"/>
-            <w:bottom w:w="0" w:type="dxa"/>
-          </w:tblCellMar>
-        </w:tblPrEx>
         <w:trPr>
           <w:tblHeader/>
         </w:trPr>
@@ -12852,12 +12108,6 @@
         </w:tc>
       </w:tr>
       <w:tr>
-        <w:tblPrEx>
-          <w:tblCellMar>
-            <w:top w:w="0" w:type="dxa"/>
-            <w:bottom w:w="0" w:type="dxa"/>
-          </w:tblCellMar>
-        </w:tblPrEx>
         <w:tc>
           <w:tcPr>
             <w:tcW w:w="2500" w:type="dxa"/>
@@ -12976,12 +12226,6 @@
         </w:tc>
       </w:tr>
       <w:tr>
-        <w:tblPrEx>
-          <w:tblCellMar>
-            <w:top w:w="0" w:type="dxa"/>
-            <w:bottom w:w="0" w:type="dxa"/>
-          </w:tblCellMar>
-        </w:tblPrEx>
         <w:tc>
           <w:tcPr>
             <w:tcW w:w="2500" w:type="dxa"/>
@@ -13110,12 +12354,6 @@
         </w:tc>
       </w:tr>
       <w:tr>
-        <w:tblPrEx>
-          <w:tblCellMar>
-            <w:top w:w="0" w:type="dxa"/>
-            <w:bottom w:w="0" w:type="dxa"/>
-          </w:tblCellMar>
-        </w:tblPrEx>
         <w:tc>
           <w:tcPr>
             <w:tcW w:w="2500" w:type="dxa"/>
@@ -13244,12 +12482,6 @@
         </w:tc>
       </w:tr>
       <w:tr>
-        <w:tblPrEx>
-          <w:tblCellMar>
-            <w:top w:w="0" w:type="dxa"/>
-            <w:bottom w:w="0" w:type="dxa"/>
-          </w:tblCellMar>
-        </w:tblPrEx>
         <w:tc>
           <w:tcPr>
             <w:tcW w:w="2500" w:type="dxa"/>
@@ -13366,12 +12598,6 @@
         </w:tc>
       </w:tr>
       <w:tr>
-        <w:tblPrEx>
-          <w:tblCellMar>
-            <w:top w:w="0" w:type="dxa"/>
-            <w:bottom w:w="0" w:type="dxa"/>
-          </w:tblCellMar>
-        </w:tblPrEx>
         <w:tc>
           <w:tcPr>
             <w:tcW w:w="2500" w:type="dxa"/>
@@ -13498,12 +12724,6 @@
         </w:tc>
       </w:tr>
       <w:tr>
-        <w:tblPrEx>
-          <w:tblCellMar>
-            <w:top w:w="0" w:type="dxa"/>
-            <w:bottom w:w="0" w:type="dxa"/>
-          </w:tblCellMar>
-        </w:tblPrEx>
         <w:tc>
           <w:tcPr>
             <w:tcW w:w="2500" w:type="dxa"/>
@@ -13630,12 +12850,6 @@
         </w:tc>
       </w:tr>
       <w:tr>
-        <w:tblPrEx>
-          <w:tblCellMar>
-            <w:top w:w="0" w:type="dxa"/>
-            <w:bottom w:w="0" w:type="dxa"/>
-          </w:tblCellMar>
-        </w:tblPrEx>
         <w:tc>
           <w:tcPr>
             <w:tcW w:w="2500" w:type="dxa"/>
@@ -13763,12 +12977,6 @@
         </w:tc>
       </w:tr>
       <w:tr>
-        <w:tblPrEx>
-          <w:tblCellMar>
-            <w:top w:w="0" w:type="dxa"/>
-            <w:bottom w:w="0" w:type="dxa"/>
-          </w:tblCellMar>
-        </w:tblPrEx>
         <w:tc>
           <w:tcPr>
             <w:tcW w:w="2500" w:type="dxa"/>
@@ -13887,12 +13095,6 @@
         </w:tc>
       </w:tr>
       <w:tr>
-        <w:tblPrEx>
-          <w:tblCellMar>
-            <w:top w:w="0" w:type="dxa"/>
-            <w:bottom w:w="0" w:type="dxa"/>
-          </w:tblCellMar>
-        </w:tblPrEx>
         <w:tc>
           <w:tcPr>
             <w:tcW w:w="2500" w:type="dxa"/>
@@ -14011,12 +13213,6 @@
         </w:tc>
       </w:tr>
       <w:tr>
-        <w:tblPrEx>
-          <w:tblCellMar>
-            <w:top w:w="0" w:type="dxa"/>
-            <w:bottom w:w="0" w:type="dxa"/>
-          </w:tblCellMar>
-        </w:tblPrEx>
         <w:tc>
           <w:tcPr>
             <w:tcW w:w="2500" w:type="dxa"/>
@@ -14133,12 +13329,6 @@
         </w:tc>
       </w:tr>
       <w:tr>
-        <w:tblPrEx>
-          <w:tblCellMar>
-            <w:top w:w="0" w:type="dxa"/>
-            <w:bottom w:w="0" w:type="dxa"/>
-          </w:tblCellMar>
-        </w:tblPrEx>
         <w:tc>
           <w:tcPr>
             <w:tcW w:w="2500" w:type="dxa"/>
@@ -14280,25 +13470,7 @@
           <w:bCs/>
           <w:color w:val="1F4E79"/>
         </w:rPr>
-        <w:t>_</w:t>
-      </w:r>
-      <w:proofErr w:type="gramStart"/>
-      <w:r>
-        <w:rPr>
-          <w:b/>
-          <w:bCs/>
-          <w:color w:val="1F4E79"/>
-        </w:rPr>
-        <w:t>PERFIL  —</w:t>
-      </w:r>
-      <w:proofErr w:type="gramEnd"/>
-      <w:r>
-        <w:rPr>
-          <w:b/>
-          <w:bCs/>
-          <w:color w:val="1F4E79"/>
-        </w:rPr>
-        <w:t xml:space="preserve">  Fotos de perfil dos usuários (histórico)</w:t>
+        <w:t>_PERFIL  —  Fotos de perfil dos usuários (histórico)</w:t>
       </w:r>
     </w:p>
     <w:tbl>
@@ -14325,12 +13497,6 @@
         <w:gridCol w:w="3300"/>
       </w:tblGrid>
       <w:tr>
-        <w:tblPrEx>
-          <w:tblCellMar>
-            <w:top w:w="0" w:type="dxa"/>
-            <w:bottom w:w="0" w:type="dxa"/>
-          </w:tblCellMar>
-        </w:tblPrEx>
         <w:trPr>
           <w:tblHeader/>
         </w:trPr>
@@ -14468,12 +13634,6 @@
         </w:tc>
       </w:tr>
       <w:tr>
-        <w:tblPrEx>
-          <w:tblCellMar>
-            <w:top w:w="0" w:type="dxa"/>
-            <w:bottom w:w="0" w:type="dxa"/>
-          </w:tblCellMar>
-        </w:tblPrEx>
         <w:tc>
           <w:tcPr>
             <w:tcW w:w="2500" w:type="dxa"/>
@@ -14592,12 +13752,6 @@
         </w:tc>
       </w:tr>
       <w:tr>
-        <w:tblPrEx>
-          <w:tblCellMar>
-            <w:top w:w="0" w:type="dxa"/>
-            <w:bottom w:w="0" w:type="dxa"/>
-          </w:tblCellMar>
-        </w:tblPrEx>
         <w:tc>
           <w:tcPr>
             <w:tcW w:w="2500" w:type="dxa"/>
@@ -14726,12 +13880,6 @@
         </w:tc>
       </w:tr>
       <w:tr>
-        <w:tblPrEx>
-          <w:tblCellMar>
-            <w:top w:w="0" w:type="dxa"/>
-            <w:bottom w:w="0" w:type="dxa"/>
-          </w:tblCellMar>
-        </w:tblPrEx>
         <w:tc>
           <w:tcPr>
             <w:tcW w:w="2500" w:type="dxa"/>
@@ -14860,12 +14008,6 @@
         </w:tc>
       </w:tr>
       <w:tr>
-        <w:tblPrEx>
-          <w:tblCellMar>
-            <w:top w:w="0" w:type="dxa"/>
-            <w:bottom w:w="0" w:type="dxa"/>
-          </w:tblCellMar>
-        </w:tblPrEx>
         <w:tc>
           <w:tcPr>
             <w:tcW w:w="2500" w:type="dxa"/>
@@ -14994,12 +14136,6 @@
         </w:tc>
       </w:tr>
       <w:tr>
-        <w:tblPrEx>
-          <w:tblCellMar>
-            <w:top w:w="0" w:type="dxa"/>
-            <w:bottom w:w="0" w:type="dxa"/>
-          </w:tblCellMar>
-        </w:tblPrEx>
         <w:tc>
           <w:tcPr>
             <w:tcW w:w="2500" w:type="dxa"/>
@@ -15166,12 +14302,6 @@
         </w:tc>
       </w:tr>
       <w:tr>
-        <w:tblPrEx>
-          <w:tblCellMar>
-            <w:top w:w="0" w:type="dxa"/>
-            <w:bottom w:w="0" w:type="dxa"/>
-          </w:tblCellMar>
-        </w:tblPrEx>
         <w:tc>
           <w:tcPr>
             <w:tcW w:w="2500" w:type="dxa"/>
@@ -15308,12 +14438,6 @@
         </w:tc>
       </w:tr>
       <w:tr>
-        <w:tblPrEx>
-          <w:tblCellMar>
-            <w:top w:w="0" w:type="dxa"/>
-            <w:bottom w:w="0" w:type="dxa"/>
-          </w:tblCellMar>
-        </w:tblPrEx>
         <w:tc>
           <w:tcPr>
             <w:tcW w:w="2500" w:type="dxa"/>
@@ -15455,6 +14579,1655 @@
                 <w:szCs w:val="17"/>
               </w:rPr>
               <w:t>)</w:t>
+            </w:r>
+          </w:p>
+        </w:tc>
+      </w:tr>
+    </w:tbl>
+    <w:p>
+      <w:pPr>
+        <w:spacing w:after="180"/>
+      </w:pPr>
+    </w:p>
+    <w:p>
+      <w:pPr>
+        <w:spacing w:before="200" w:after="60"/>
+      </w:pPr>
+      <w:proofErr w:type="gramStart"/>
+      <w:r>
+        <w:rPr>
+          <w:b/>
+          <w:bCs/>
+          <w:color w:val="1F4E79"/>
+        </w:rPr>
+        <w:t>▶  F</w:t>
+      </w:r>
+      <w:r>
+        <w:rPr>
+          <w:b/>
+          <w:bCs/>
+          <w:color w:val="1F4E79"/>
+        </w:rPr>
+        <w:t>EEDBACK</w:t>
+      </w:r>
+      <w:proofErr w:type="gramEnd"/>
+      <w:r>
+        <w:rPr>
+          <w:b/>
+          <w:bCs/>
+          <w:color w:val="1F4E79"/>
+        </w:rPr>
+        <w:t xml:space="preserve">  —  </w:t>
+      </w:r>
+      <w:r>
+        <w:rPr>
+          <w:b/>
+          <w:bCs/>
+          <w:color w:val="1F4E79"/>
+        </w:rPr>
+        <w:t xml:space="preserve">Feedback dos </w:t>
+      </w:r>
+      <w:r>
+        <w:rPr>
+          <w:b/>
+          <w:bCs/>
+          <w:color w:val="1F4E79"/>
+        </w:rPr>
+        <w:t>usuários</w:t>
+      </w:r>
+    </w:p>
+    <w:tbl>
+      <w:tblPr>
+        <w:tblW w:w="9200" w:type="dxa"/>
+        <w:tblBorders>
+          <w:top w:val="single" w:sz="4" w:space="0" w:color="auto"/>
+          <w:left w:val="single" w:sz="4" w:space="0" w:color="auto"/>
+          <w:bottom w:val="single" w:sz="4" w:space="0" w:color="auto"/>
+          <w:right w:val="single" w:sz="4" w:space="0" w:color="auto"/>
+          <w:insideH w:val="single" w:sz="4" w:space="0" w:color="auto"/>
+          <w:insideV w:val="single" w:sz="4" w:space="0" w:color="auto"/>
+        </w:tblBorders>
+        <w:tblCellMar>
+          <w:left w:w="10" w:type="dxa"/>
+          <w:right w:w="10" w:type="dxa"/>
+        </w:tblCellMar>
+        <w:tblLook w:val="04A0" w:firstRow="1" w:lastRow="0" w:firstColumn="1" w:lastColumn="0" w:noHBand="0" w:noVBand="1"/>
+      </w:tblPr>
+      <w:tblGrid>
+        <w:gridCol w:w="2500"/>
+        <w:gridCol w:w="1600"/>
+        <w:gridCol w:w="1800"/>
+        <w:gridCol w:w="3300"/>
+      </w:tblGrid>
+      <w:tr>
+        <w:trPr>
+          <w:tblHeader/>
+        </w:trPr>
+        <w:tc>
+          <w:tcPr>
+            <w:tcW w:w="2500" w:type="dxa"/>
+            <w:tcBorders>
+              <w:top w:val="single" w:sz="1" w:space="0" w:color="1F4E79"/>
+              <w:left w:val="single" w:sz="1" w:space="0" w:color="1F4E79"/>
+              <w:bottom w:val="single" w:sz="1" w:space="0" w:color="1F4E79"/>
+              <w:right w:val="single" w:sz="1" w:space="0" w:color="1F4E79"/>
+            </w:tcBorders>
+            <w:shd w:val="clear" w:color="auto" w:fill="1F4E79"/>
+            <w:tcMar>
+              <w:top w:w="90" w:type="dxa"/>
+              <w:left w:w="110" w:type="dxa"/>
+              <w:bottom w:w="90" w:type="dxa"/>
+              <w:right w:w="110" w:type="dxa"/>
+            </w:tcMar>
+          </w:tcPr>
+          <w:p>
+            <w:pPr>
+              <w:jc w:val="center"/>
+            </w:pPr>
+            <w:r>
+              <w:rPr>
+                <w:b/>
+                <w:bCs/>
+                <w:color w:val="FFFFFF"/>
+                <w:sz w:val="18"/>
+                <w:szCs w:val="18"/>
+              </w:rPr>
+              <w:t>Coluna</w:t>
+            </w:r>
+          </w:p>
+        </w:tc>
+        <w:tc>
+          <w:tcPr>
+            <w:tcW w:w="1600" w:type="dxa"/>
+            <w:tcBorders>
+              <w:top w:val="single" w:sz="1" w:space="0" w:color="1F4E79"/>
+              <w:left w:val="single" w:sz="1" w:space="0" w:color="1F4E79"/>
+              <w:bottom w:val="single" w:sz="1" w:space="0" w:color="1F4E79"/>
+              <w:right w:val="single" w:sz="1" w:space="0" w:color="1F4E79"/>
+            </w:tcBorders>
+            <w:shd w:val="clear" w:color="auto" w:fill="1F4E79"/>
+            <w:tcMar>
+              <w:top w:w="90" w:type="dxa"/>
+              <w:left w:w="110" w:type="dxa"/>
+              <w:bottom w:w="90" w:type="dxa"/>
+              <w:right w:w="110" w:type="dxa"/>
+            </w:tcMar>
+          </w:tcPr>
+          <w:p>
+            <w:pPr>
+              <w:jc w:val="center"/>
+            </w:pPr>
+            <w:r>
+              <w:rPr>
+                <w:b/>
+                <w:bCs/>
+                <w:color w:val="FFFFFF"/>
+                <w:sz w:val="18"/>
+                <w:szCs w:val="18"/>
+              </w:rPr>
+              <w:t>Tipo</w:t>
+            </w:r>
+          </w:p>
+        </w:tc>
+        <w:tc>
+          <w:tcPr>
+            <w:tcW w:w="1800" w:type="dxa"/>
+            <w:tcBorders>
+              <w:top w:val="single" w:sz="1" w:space="0" w:color="1F4E79"/>
+              <w:left w:val="single" w:sz="1" w:space="0" w:color="1F4E79"/>
+              <w:bottom w:val="single" w:sz="1" w:space="0" w:color="1F4E79"/>
+              <w:right w:val="single" w:sz="1" w:space="0" w:color="1F4E79"/>
+            </w:tcBorders>
+            <w:shd w:val="clear" w:color="auto" w:fill="1F4E79"/>
+            <w:tcMar>
+              <w:top w:w="90" w:type="dxa"/>
+              <w:left w:w="110" w:type="dxa"/>
+              <w:bottom w:w="90" w:type="dxa"/>
+              <w:right w:w="110" w:type="dxa"/>
+            </w:tcMar>
+          </w:tcPr>
+          <w:p>
+            <w:pPr>
+              <w:jc w:val="center"/>
+            </w:pPr>
+            <w:r>
+              <w:rPr>
+                <w:b/>
+                <w:bCs/>
+                <w:color w:val="FFFFFF"/>
+                <w:sz w:val="18"/>
+                <w:szCs w:val="18"/>
+              </w:rPr>
+              <w:t>Restrição</w:t>
+            </w:r>
+          </w:p>
+        </w:tc>
+        <w:tc>
+          <w:tcPr>
+            <w:tcW w:w="3300" w:type="dxa"/>
+            <w:tcBorders>
+              <w:top w:val="single" w:sz="1" w:space="0" w:color="1F4E79"/>
+              <w:left w:val="single" w:sz="1" w:space="0" w:color="1F4E79"/>
+              <w:bottom w:val="single" w:sz="1" w:space="0" w:color="1F4E79"/>
+              <w:right w:val="single" w:sz="1" w:space="0" w:color="1F4E79"/>
+            </w:tcBorders>
+            <w:shd w:val="clear" w:color="auto" w:fill="1F4E79"/>
+            <w:tcMar>
+              <w:top w:w="90" w:type="dxa"/>
+              <w:left w:w="110" w:type="dxa"/>
+              <w:bottom w:w="90" w:type="dxa"/>
+              <w:right w:w="110" w:type="dxa"/>
+            </w:tcMar>
+          </w:tcPr>
+          <w:p>
+            <w:pPr>
+              <w:jc w:val="center"/>
+            </w:pPr>
+            <w:r>
+              <w:rPr>
+                <w:b/>
+                <w:bCs/>
+                <w:color w:val="FFFFFF"/>
+                <w:sz w:val="18"/>
+                <w:szCs w:val="18"/>
+              </w:rPr>
+              <w:t>Descrição</w:t>
+            </w:r>
+          </w:p>
+        </w:tc>
+      </w:tr>
+      <w:tr>
+        <w:tc>
+          <w:tcPr>
+            <w:tcW w:w="2500" w:type="dxa"/>
+            <w:tcBorders>
+              <w:top w:val="single" w:sz="1" w:space="0" w:color="AAAAAA"/>
+              <w:left w:val="single" w:sz="1" w:space="0" w:color="AAAAAA"/>
+              <w:bottom w:val="single" w:sz="1" w:space="0" w:color="AAAAAA"/>
+              <w:right w:val="single" w:sz="1" w:space="0" w:color="AAAAAA"/>
+            </w:tcBorders>
+            <w:shd w:val="clear" w:color="auto" w:fill="FFFFFF"/>
+            <w:tcMar>
+              <w:top w:w="70" w:type="dxa"/>
+              <w:left w:w="110" w:type="dxa"/>
+              <w:bottom w:w="70" w:type="dxa"/>
+              <w:right w:w="110" w:type="dxa"/>
+            </w:tcMar>
+          </w:tcPr>
+          <w:p>
+            <w:proofErr w:type="spellStart"/>
+            <w:r>
+              <w:rPr>
+                <w:b/>
+                <w:bCs/>
+                <w:color w:val="000000"/>
+                <w:sz w:val="17"/>
+                <w:szCs w:val="17"/>
+              </w:rPr>
+              <w:t>id_f</w:t>
+            </w:r>
+            <w:r>
+              <w:rPr>
+                <w:b/>
+                <w:bCs/>
+                <w:color w:val="000000"/>
+                <w:sz w:val="17"/>
+                <w:szCs w:val="17"/>
+              </w:rPr>
+              <w:t>eedback</w:t>
+            </w:r>
+            <w:proofErr w:type="spellEnd"/>
+          </w:p>
+        </w:tc>
+        <w:tc>
+          <w:tcPr>
+            <w:tcW w:w="1600" w:type="dxa"/>
+            <w:tcBorders>
+              <w:top w:val="single" w:sz="1" w:space="0" w:color="AAAAAA"/>
+              <w:left w:val="single" w:sz="1" w:space="0" w:color="AAAAAA"/>
+              <w:bottom w:val="single" w:sz="1" w:space="0" w:color="AAAAAA"/>
+              <w:right w:val="single" w:sz="1" w:space="0" w:color="AAAAAA"/>
+            </w:tcBorders>
+            <w:shd w:val="clear" w:color="auto" w:fill="FFFFFF"/>
+            <w:tcMar>
+              <w:top w:w="70" w:type="dxa"/>
+              <w:left w:w="110" w:type="dxa"/>
+              <w:bottom w:w="70" w:type="dxa"/>
+              <w:right w:w="110" w:type="dxa"/>
+            </w:tcMar>
+          </w:tcPr>
+          <w:p>
+            <w:r>
+              <w:rPr>
+                <w:color w:val="000000"/>
+                <w:sz w:val="17"/>
+                <w:szCs w:val="17"/>
+              </w:rPr>
+              <w:t>INT</w:t>
+            </w:r>
+          </w:p>
+        </w:tc>
+        <w:tc>
+          <w:tcPr>
+            <w:tcW w:w="1800" w:type="dxa"/>
+            <w:tcBorders>
+              <w:top w:val="single" w:sz="1" w:space="0" w:color="AAAAAA"/>
+              <w:left w:val="single" w:sz="1" w:space="0" w:color="AAAAAA"/>
+              <w:bottom w:val="single" w:sz="1" w:space="0" w:color="AAAAAA"/>
+              <w:right w:val="single" w:sz="1" w:space="0" w:color="AAAAAA"/>
+            </w:tcBorders>
+            <w:shd w:val="clear" w:color="auto" w:fill="FFFFFF"/>
+            <w:tcMar>
+              <w:top w:w="70" w:type="dxa"/>
+              <w:left w:w="110" w:type="dxa"/>
+              <w:bottom w:w="70" w:type="dxa"/>
+              <w:right w:w="110" w:type="dxa"/>
+            </w:tcMar>
+          </w:tcPr>
+          <w:p>
+            <w:r>
+              <w:rPr>
+                <w:color w:val="000000"/>
+                <w:sz w:val="17"/>
+                <w:szCs w:val="17"/>
+              </w:rPr>
+              <w:t>PK, AUTO_INCREMENT</w:t>
+            </w:r>
+          </w:p>
+        </w:tc>
+        <w:tc>
+          <w:tcPr>
+            <w:tcW w:w="3300" w:type="dxa"/>
+            <w:tcBorders>
+              <w:top w:val="single" w:sz="1" w:space="0" w:color="AAAAAA"/>
+              <w:left w:val="single" w:sz="1" w:space="0" w:color="AAAAAA"/>
+              <w:bottom w:val="single" w:sz="1" w:space="0" w:color="AAAAAA"/>
+              <w:right w:val="single" w:sz="1" w:space="0" w:color="AAAAAA"/>
+            </w:tcBorders>
+            <w:shd w:val="clear" w:color="auto" w:fill="FFFFFF"/>
+            <w:tcMar>
+              <w:top w:w="70" w:type="dxa"/>
+              <w:left w:w="110" w:type="dxa"/>
+              <w:bottom w:w="70" w:type="dxa"/>
+              <w:right w:w="110" w:type="dxa"/>
+            </w:tcMar>
+          </w:tcPr>
+          <w:p>
+            <w:r>
+              <w:rPr>
+                <w:color w:val="000000"/>
+                <w:sz w:val="17"/>
+                <w:szCs w:val="17"/>
+              </w:rPr>
+              <w:t>Identificador único</w:t>
+            </w:r>
+          </w:p>
+        </w:tc>
+      </w:tr>
+      <w:tr>
+        <w:tc>
+          <w:tcPr>
+            <w:tcW w:w="2500" w:type="dxa"/>
+            <w:tcBorders>
+              <w:top w:val="single" w:sz="1" w:space="0" w:color="AAAAAA"/>
+              <w:left w:val="single" w:sz="1" w:space="0" w:color="AAAAAA"/>
+              <w:bottom w:val="single" w:sz="1" w:space="0" w:color="AAAAAA"/>
+              <w:right w:val="single" w:sz="1" w:space="0" w:color="AAAAAA"/>
+            </w:tcBorders>
+            <w:shd w:val="clear" w:color="auto" w:fill="EEF4FF"/>
+            <w:tcMar>
+              <w:top w:w="70" w:type="dxa"/>
+              <w:left w:w="110" w:type="dxa"/>
+              <w:bottom w:w="70" w:type="dxa"/>
+              <w:right w:w="110" w:type="dxa"/>
+            </w:tcMar>
+          </w:tcPr>
+          <w:p>
+            <w:proofErr w:type="spellStart"/>
+            <w:r>
+              <w:rPr>
+                <w:b/>
+                <w:bCs/>
+                <w:color w:val="000000"/>
+                <w:sz w:val="17"/>
+                <w:szCs w:val="17"/>
+              </w:rPr>
+              <w:t>usuario_id_usuario</w:t>
+            </w:r>
+            <w:proofErr w:type="spellEnd"/>
+          </w:p>
+        </w:tc>
+        <w:tc>
+          <w:tcPr>
+            <w:tcW w:w="1600" w:type="dxa"/>
+            <w:tcBorders>
+              <w:top w:val="single" w:sz="1" w:space="0" w:color="AAAAAA"/>
+              <w:left w:val="single" w:sz="1" w:space="0" w:color="AAAAAA"/>
+              <w:bottom w:val="single" w:sz="1" w:space="0" w:color="AAAAAA"/>
+              <w:right w:val="single" w:sz="1" w:space="0" w:color="AAAAAA"/>
+            </w:tcBorders>
+            <w:shd w:val="clear" w:color="auto" w:fill="EEF4FF"/>
+            <w:tcMar>
+              <w:top w:w="70" w:type="dxa"/>
+              <w:left w:w="110" w:type="dxa"/>
+              <w:bottom w:w="70" w:type="dxa"/>
+              <w:right w:w="110" w:type="dxa"/>
+            </w:tcMar>
+          </w:tcPr>
+          <w:p>
+            <w:r>
+              <w:rPr>
+                <w:color w:val="000000"/>
+                <w:sz w:val="17"/>
+                <w:szCs w:val="17"/>
+              </w:rPr>
+              <w:t>INT</w:t>
+            </w:r>
+          </w:p>
+        </w:tc>
+        <w:tc>
+          <w:tcPr>
+            <w:tcW w:w="1800" w:type="dxa"/>
+            <w:tcBorders>
+              <w:top w:val="single" w:sz="1" w:space="0" w:color="AAAAAA"/>
+              <w:left w:val="single" w:sz="1" w:space="0" w:color="AAAAAA"/>
+              <w:bottom w:val="single" w:sz="1" w:space="0" w:color="AAAAAA"/>
+              <w:right w:val="single" w:sz="1" w:space="0" w:color="AAAAAA"/>
+            </w:tcBorders>
+            <w:shd w:val="clear" w:color="auto" w:fill="EEF4FF"/>
+            <w:tcMar>
+              <w:top w:w="70" w:type="dxa"/>
+              <w:left w:w="110" w:type="dxa"/>
+              <w:bottom w:w="70" w:type="dxa"/>
+              <w:right w:w="110" w:type="dxa"/>
+            </w:tcMar>
+          </w:tcPr>
+          <w:p>
+            <w:r>
+              <w:rPr>
+                <w:color w:val="000000"/>
+                <w:sz w:val="17"/>
+                <w:szCs w:val="17"/>
+              </w:rPr>
+              <w:t>FK → USUARIO</w:t>
+            </w:r>
+          </w:p>
+        </w:tc>
+        <w:tc>
+          <w:tcPr>
+            <w:tcW w:w="3300" w:type="dxa"/>
+            <w:tcBorders>
+              <w:top w:val="single" w:sz="1" w:space="0" w:color="AAAAAA"/>
+              <w:left w:val="single" w:sz="1" w:space="0" w:color="AAAAAA"/>
+              <w:bottom w:val="single" w:sz="1" w:space="0" w:color="AAAAAA"/>
+              <w:right w:val="single" w:sz="1" w:space="0" w:color="AAAAAA"/>
+            </w:tcBorders>
+            <w:shd w:val="clear" w:color="auto" w:fill="EEF4FF"/>
+            <w:tcMar>
+              <w:top w:w="70" w:type="dxa"/>
+              <w:left w:w="110" w:type="dxa"/>
+              <w:bottom w:w="70" w:type="dxa"/>
+              <w:right w:w="110" w:type="dxa"/>
+            </w:tcMar>
+          </w:tcPr>
+          <w:p>
+            <w:proofErr w:type="spellStart"/>
+            <w:r>
+              <w:rPr>
+                <w:color w:val="000000"/>
+                <w:sz w:val="17"/>
+                <w:szCs w:val="17"/>
+              </w:rPr>
+              <w:t>Usuario</w:t>
+            </w:r>
+            <w:proofErr w:type="spellEnd"/>
+            <w:r>
+              <w:rPr>
+                <w:color w:val="000000"/>
+                <w:sz w:val="17"/>
+                <w:szCs w:val="17"/>
+              </w:rPr>
+              <w:t xml:space="preserve"> dono </w:t>
+            </w:r>
+            <w:r>
+              <w:rPr>
+                <w:color w:val="000000"/>
+                <w:sz w:val="17"/>
+                <w:szCs w:val="17"/>
+              </w:rPr>
+              <w:t>do Feedback</w:t>
+            </w:r>
+          </w:p>
+        </w:tc>
+      </w:tr>
+      <w:tr>
+        <w:tc>
+          <w:tcPr>
+            <w:tcW w:w="2500" w:type="dxa"/>
+            <w:tcBorders>
+              <w:top w:val="single" w:sz="1" w:space="0" w:color="AAAAAA"/>
+              <w:left w:val="single" w:sz="1" w:space="0" w:color="AAAAAA"/>
+              <w:bottom w:val="single" w:sz="1" w:space="0" w:color="AAAAAA"/>
+              <w:right w:val="single" w:sz="1" w:space="0" w:color="AAAAAA"/>
+            </w:tcBorders>
+            <w:shd w:val="clear" w:color="auto" w:fill="FFFFFF"/>
+            <w:tcMar>
+              <w:top w:w="70" w:type="dxa"/>
+              <w:left w:w="110" w:type="dxa"/>
+              <w:bottom w:w="70" w:type="dxa"/>
+              <w:right w:w="110" w:type="dxa"/>
+            </w:tcMar>
+          </w:tcPr>
+          <w:p>
+            <w:proofErr w:type="spellStart"/>
+            <w:r>
+              <w:rPr>
+                <w:b/>
+                <w:bCs/>
+                <w:color w:val="000000"/>
+                <w:sz w:val="17"/>
+                <w:szCs w:val="17"/>
+              </w:rPr>
+              <w:t>nome_feedback</w:t>
+            </w:r>
+            <w:proofErr w:type="spellEnd"/>
+          </w:p>
+        </w:tc>
+        <w:tc>
+          <w:tcPr>
+            <w:tcW w:w="1600" w:type="dxa"/>
+            <w:tcBorders>
+              <w:top w:val="single" w:sz="1" w:space="0" w:color="AAAAAA"/>
+              <w:left w:val="single" w:sz="1" w:space="0" w:color="AAAAAA"/>
+              <w:bottom w:val="single" w:sz="1" w:space="0" w:color="AAAAAA"/>
+              <w:right w:val="single" w:sz="1" w:space="0" w:color="AAAAAA"/>
+            </w:tcBorders>
+            <w:shd w:val="clear" w:color="auto" w:fill="FFFFFF"/>
+            <w:tcMar>
+              <w:top w:w="70" w:type="dxa"/>
+              <w:left w:w="110" w:type="dxa"/>
+              <w:bottom w:w="70" w:type="dxa"/>
+              <w:right w:w="110" w:type="dxa"/>
+            </w:tcMar>
+          </w:tcPr>
+          <w:p>
+            <w:proofErr w:type="gramStart"/>
+            <w:r>
+              <w:rPr>
+                <w:color w:val="000000"/>
+                <w:sz w:val="17"/>
+                <w:szCs w:val="17"/>
+              </w:rPr>
+              <w:t>VARCHAR(</w:t>
+            </w:r>
+            <w:proofErr w:type="gramEnd"/>
+            <w:r>
+              <w:rPr>
+                <w:color w:val="000000"/>
+                <w:sz w:val="17"/>
+                <w:szCs w:val="17"/>
+              </w:rPr>
+              <w:t>120</w:t>
+            </w:r>
+            <w:r>
+              <w:rPr>
+                <w:color w:val="000000"/>
+                <w:sz w:val="17"/>
+                <w:szCs w:val="17"/>
+              </w:rPr>
+              <w:t>)</w:t>
+            </w:r>
+          </w:p>
+        </w:tc>
+        <w:tc>
+          <w:tcPr>
+            <w:tcW w:w="1800" w:type="dxa"/>
+            <w:tcBorders>
+              <w:top w:val="single" w:sz="1" w:space="0" w:color="AAAAAA"/>
+              <w:left w:val="single" w:sz="1" w:space="0" w:color="AAAAAA"/>
+              <w:bottom w:val="single" w:sz="1" w:space="0" w:color="AAAAAA"/>
+              <w:right w:val="single" w:sz="1" w:space="0" w:color="AAAAAA"/>
+            </w:tcBorders>
+            <w:shd w:val="clear" w:color="auto" w:fill="FFFFFF"/>
+            <w:tcMar>
+              <w:top w:w="70" w:type="dxa"/>
+              <w:left w:w="110" w:type="dxa"/>
+              <w:bottom w:w="70" w:type="dxa"/>
+              <w:right w:w="110" w:type="dxa"/>
+            </w:tcMar>
+          </w:tcPr>
+          <w:p>
+            <w:r>
+              <w:rPr>
+                <w:color w:val="000000"/>
+                <w:sz w:val="17"/>
+                <w:szCs w:val="17"/>
+              </w:rPr>
+              <w:t>NOT NULL</w:t>
+            </w:r>
+          </w:p>
+        </w:tc>
+        <w:tc>
+          <w:tcPr>
+            <w:tcW w:w="3300" w:type="dxa"/>
+            <w:tcBorders>
+              <w:top w:val="single" w:sz="1" w:space="0" w:color="AAAAAA"/>
+              <w:left w:val="single" w:sz="1" w:space="0" w:color="AAAAAA"/>
+              <w:bottom w:val="single" w:sz="1" w:space="0" w:color="AAAAAA"/>
+              <w:right w:val="single" w:sz="1" w:space="0" w:color="AAAAAA"/>
+            </w:tcBorders>
+            <w:shd w:val="clear" w:color="auto" w:fill="FFFFFF"/>
+            <w:tcMar>
+              <w:top w:w="70" w:type="dxa"/>
+              <w:left w:w="110" w:type="dxa"/>
+              <w:bottom w:w="70" w:type="dxa"/>
+              <w:right w:w="110" w:type="dxa"/>
+            </w:tcMar>
+          </w:tcPr>
+          <w:p>
+            <w:r>
+              <w:rPr>
+                <w:color w:val="000000"/>
+                <w:sz w:val="17"/>
+                <w:szCs w:val="17"/>
+              </w:rPr>
+              <w:t xml:space="preserve">Nome do Usuário que enviou </w:t>
+            </w:r>
+          </w:p>
+        </w:tc>
+      </w:tr>
+      <w:tr>
+        <w:tc>
+          <w:tcPr>
+            <w:tcW w:w="2500" w:type="dxa"/>
+            <w:tcBorders>
+              <w:top w:val="single" w:sz="1" w:space="0" w:color="AAAAAA"/>
+              <w:left w:val="single" w:sz="1" w:space="0" w:color="AAAAAA"/>
+              <w:bottom w:val="single" w:sz="1" w:space="0" w:color="AAAAAA"/>
+              <w:right w:val="single" w:sz="1" w:space="0" w:color="AAAAAA"/>
+            </w:tcBorders>
+            <w:shd w:val="clear" w:color="auto" w:fill="EEF4FF"/>
+            <w:tcMar>
+              <w:top w:w="70" w:type="dxa"/>
+              <w:left w:w="110" w:type="dxa"/>
+              <w:bottom w:w="70" w:type="dxa"/>
+              <w:right w:w="110" w:type="dxa"/>
+            </w:tcMar>
+          </w:tcPr>
+          <w:p>
+            <w:proofErr w:type="spellStart"/>
+            <w:r>
+              <w:rPr>
+                <w:b/>
+                <w:bCs/>
+                <w:color w:val="000000"/>
+                <w:sz w:val="17"/>
+                <w:szCs w:val="17"/>
+              </w:rPr>
+              <w:t>email_feedback</w:t>
+            </w:r>
+            <w:proofErr w:type="spellEnd"/>
+          </w:p>
+        </w:tc>
+        <w:tc>
+          <w:tcPr>
+            <w:tcW w:w="1600" w:type="dxa"/>
+            <w:tcBorders>
+              <w:top w:val="single" w:sz="1" w:space="0" w:color="AAAAAA"/>
+              <w:left w:val="single" w:sz="1" w:space="0" w:color="AAAAAA"/>
+              <w:bottom w:val="single" w:sz="1" w:space="0" w:color="AAAAAA"/>
+              <w:right w:val="single" w:sz="1" w:space="0" w:color="AAAAAA"/>
+            </w:tcBorders>
+            <w:shd w:val="clear" w:color="auto" w:fill="EEF4FF"/>
+            <w:tcMar>
+              <w:top w:w="70" w:type="dxa"/>
+              <w:left w:w="110" w:type="dxa"/>
+              <w:bottom w:w="70" w:type="dxa"/>
+              <w:right w:w="110" w:type="dxa"/>
+            </w:tcMar>
+          </w:tcPr>
+          <w:p>
+            <w:proofErr w:type="gramStart"/>
+            <w:r>
+              <w:rPr>
+                <w:color w:val="000000"/>
+                <w:sz w:val="17"/>
+                <w:szCs w:val="17"/>
+              </w:rPr>
+              <w:t>VARCHAR(</w:t>
+            </w:r>
+            <w:proofErr w:type="gramEnd"/>
+            <w:r>
+              <w:rPr>
+                <w:color w:val="000000"/>
+                <w:sz w:val="17"/>
+                <w:szCs w:val="17"/>
+              </w:rPr>
+              <w:t>12</w:t>
+            </w:r>
+            <w:r>
+              <w:rPr>
+                <w:color w:val="000000"/>
+                <w:sz w:val="17"/>
+                <w:szCs w:val="17"/>
+              </w:rPr>
+              <w:t>0)</w:t>
+            </w:r>
+          </w:p>
+        </w:tc>
+        <w:tc>
+          <w:tcPr>
+            <w:tcW w:w="1800" w:type="dxa"/>
+            <w:tcBorders>
+              <w:top w:val="single" w:sz="1" w:space="0" w:color="AAAAAA"/>
+              <w:left w:val="single" w:sz="1" w:space="0" w:color="AAAAAA"/>
+              <w:bottom w:val="single" w:sz="1" w:space="0" w:color="AAAAAA"/>
+              <w:right w:val="single" w:sz="1" w:space="0" w:color="AAAAAA"/>
+            </w:tcBorders>
+            <w:shd w:val="clear" w:color="auto" w:fill="EEF4FF"/>
+            <w:tcMar>
+              <w:top w:w="70" w:type="dxa"/>
+              <w:left w:w="110" w:type="dxa"/>
+              <w:bottom w:w="70" w:type="dxa"/>
+              <w:right w:w="110" w:type="dxa"/>
+            </w:tcMar>
+          </w:tcPr>
+          <w:p>
+            <w:r>
+              <w:rPr>
+                <w:color w:val="000000"/>
+                <w:sz w:val="17"/>
+                <w:szCs w:val="17"/>
+              </w:rPr>
+              <w:t>NOT NULL</w:t>
+            </w:r>
+          </w:p>
+        </w:tc>
+        <w:tc>
+          <w:tcPr>
+            <w:tcW w:w="3300" w:type="dxa"/>
+            <w:tcBorders>
+              <w:top w:val="single" w:sz="1" w:space="0" w:color="AAAAAA"/>
+              <w:left w:val="single" w:sz="1" w:space="0" w:color="AAAAAA"/>
+              <w:bottom w:val="single" w:sz="1" w:space="0" w:color="AAAAAA"/>
+              <w:right w:val="single" w:sz="1" w:space="0" w:color="AAAAAA"/>
+            </w:tcBorders>
+            <w:shd w:val="clear" w:color="auto" w:fill="EEF4FF"/>
+            <w:tcMar>
+              <w:top w:w="70" w:type="dxa"/>
+              <w:left w:w="110" w:type="dxa"/>
+              <w:bottom w:w="70" w:type="dxa"/>
+              <w:right w:w="110" w:type="dxa"/>
+            </w:tcMar>
+          </w:tcPr>
+          <w:p>
+            <w:r>
+              <w:rPr>
+                <w:color w:val="000000"/>
+                <w:sz w:val="17"/>
+                <w:szCs w:val="17"/>
+              </w:rPr>
+              <w:t>Email do usuário</w:t>
+            </w:r>
+          </w:p>
+        </w:tc>
+      </w:tr>
+      <w:tr>
+        <w:tc>
+          <w:tcPr>
+            <w:tcW w:w="2500" w:type="dxa"/>
+            <w:tcBorders>
+              <w:top w:val="single" w:sz="1" w:space="0" w:color="AAAAAA"/>
+              <w:left w:val="single" w:sz="1" w:space="0" w:color="AAAAAA"/>
+              <w:bottom w:val="single" w:sz="1" w:space="0" w:color="AAAAAA"/>
+              <w:right w:val="single" w:sz="1" w:space="0" w:color="AAAAAA"/>
+            </w:tcBorders>
+            <w:shd w:val="clear" w:color="auto" w:fill="EEF4FF"/>
+            <w:tcMar>
+              <w:top w:w="70" w:type="dxa"/>
+              <w:left w:w="110" w:type="dxa"/>
+              <w:bottom w:w="70" w:type="dxa"/>
+              <w:right w:w="110" w:type="dxa"/>
+            </w:tcMar>
+          </w:tcPr>
+          <w:p>
+            <w:pPr>
+              <w:rPr>
+                <w:b/>
+                <w:bCs/>
+                <w:color w:val="000000"/>
+                <w:sz w:val="17"/>
+                <w:szCs w:val="17"/>
+              </w:rPr>
+            </w:pPr>
+            <w:proofErr w:type="spellStart"/>
+            <w:r>
+              <w:rPr>
+                <w:b/>
+                <w:bCs/>
+                <w:color w:val="000000"/>
+                <w:sz w:val="17"/>
+                <w:szCs w:val="17"/>
+              </w:rPr>
+              <w:t>turma_feedback</w:t>
+            </w:r>
+            <w:proofErr w:type="spellEnd"/>
+          </w:p>
+        </w:tc>
+        <w:tc>
+          <w:tcPr>
+            <w:tcW w:w="1600" w:type="dxa"/>
+            <w:tcBorders>
+              <w:top w:val="single" w:sz="1" w:space="0" w:color="AAAAAA"/>
+              <w:left w:val="single" w:sz="1" w:space="0" w:color="AAAAAA"/>
+              <w:bottom w:val="single" w:sz="1" w:space="0" w:color="AAAAAA"/>
+              <w:right w:val="single" w:sz="1" w:space="0" w:color="AAAAAA"/>
+            </w:tcBorders>
+            <w:shd w:val="clear" w:color="auto" w:fill="EEF4FF"/>
+            <w:tcMar>
+              <w:top w:w="70" w:type="dxa"/>
+              <w:left w:w="110" w:type="dxa"/>
+              <w:bottom w:w="70" w:type="dxa"/>
+              <w:right w:w="110" w:type="dxa"/>
+            </w:tcMar>
+          </w:tcPr>
+          <w:p>
+            <w:pPr>
+              <w:rPr>
+                <w:color w:val="000000"/>
+                <w:sz w:val="17"/>
+                <w:szCs w:val="17"/>
+              </w:rPr>
+            </w:pPr>
+            <w:proofErr w:type="gramStart"/>
+            <w:r>
+              <w:rPr>
+                <w:color w:val="000000"/>
+                <w:sz w:val="17"/>
+                <w:szCs w:val="17"/>
+              </w:rPr>
+              <w:t>VARCHAR(</w:t>
+            </w:r>
+            <w:proofErr w:type="gramEnd"/>
+            <w:r>
+              <w:rPr>
+                <w:color w:val="000000"/>
+                <w:sz w:val="17"/>
+                <w:szCs w:val="17"/>
+              </w:rPr>
+              <w:t>20)</w:t>
+            </w:r>
+          </w:p>
+        </w:tc>
+        <w:tc>
+          <w:tcPr>
+            <w:tcW w:w="1800" w:type="dxa"/>
+            <w:tcBorders>
+              <w:top w:val="single" w:sz="1" w:space="0" w:color="AAAAAA"/>
+              <w:left w:val="single" w:sz="1" w:space="0" w:color="AAAAAA"/>
+              <w:bottom w:val="single" w:sz="1" w:space="0" w:color="AAAAAA"/>
+              <w:right w:val="single" w:sz="1" w:space="0" w:color="AAAAAA"/>
+            </w:tcBorders>
+            <w:shd w:val="clear" w:color="auto" w:fill="EEF4FF"/>
+            <w:tcMar>
+              <w:top w:w="70" w:type="dxa"/>
+              <w:left w:w="110" w:type="dxa"/>
+              <w:bottom w:w="70" w:type="dxa"/>
+              <w:right w:w="110" w:type="dxa"/>
+            </w:tcMar>
+          </w:tcPr>
+          <w:p>
+            <w:pPr>
+              <w:rPr>
+                <w:color w:val="000000"/>
+                <w:sz w:val="17"/>
+                <w:szCs w:val="17"/>
+              </w:rPr>
+            </w:pPr>
+            <w:r>
+              <w:rPr>
+                <w:color w:val="000000"/>
+                <w:sz w:val="17"/>
+                <w:szCs w:val="17"/>
+              </w:rPr>
+              <w:t>NOT NULL</w:t>
+            </w:r>
+          </w:p>
+        </w:tc>
+        <w:tc>
+          <w:tcPr>
+            <w:tcW w:w="3300" w:type="dxa"/>
+            <w:tcBorders>
+              <w:top w:val="single" w:sz="1" w:space="0" w:color="AAAAAA"/>
+              <w:left w:val="single" w:sz="1" w:space="0" w:color="AAAAAA"/>
+              <w:bottom w:val="single" w:sz="1" w:space="0" w:color="AAAAAA"/>
+              <w:right w:val="single" w:sz="1" w:space="0" w:color="AAAAAA"/>
+            </w:tcBorders>
+            <w:shd w:val="clear" w:color="auto" w:fill="EEF4FF"/>
+            <w:tcMar>
+              <w:top w:w="70" w:type="dxa"/>
+              <w:left w:w="110" w:type="dxa"/>
+              <w:bottom w:w="70" w:type="dxa"/>
+              <w:right w:w="110" w:type="dxa"/>
+            </w:tcMar>
+          </w:tcPr>
+          <w:p>
+            <w:pPr>
+              <w:rPr>
+                <w:color w:val="000000"/>
+                <w:sz w:val="17"/>
+                <w:szCs w:val="17"/>
+              </w:rPr>
+            </w:pPr>
+            <w:r>
+              <w:rPr>
+                <w:color w:val="000000"/>
+                <w:sz w:val="17"/>
+                <w:szCs w:val="17"/>
+              </w:rPr>
+              <w:t>Turma do usuário</w:t>
+            </w:r>
+          </w:p>
+        </w:tc>
+      </w:tr>
+      <w:tr>
+        <w:tc>
+          <w:tcPr>
+            <w:tcW w:w="2500" w:type="dxa"/>
+            <w:tcBorders>
+              <w:top w:val="single" w:sz="1" w:space="0" w:color="AAAAAA"/>
+              <w:left w:val="single" w:sz="1" w:space="0" w:color="AAAAAA"/>
+              <w:bottom w:val="single" w:sz="1" w:space="0" w:color="AAAAAA"/>
+              <w:right w:val="single" w:sz="1" w:space="0" w:color="AAAAAA"/>
+            </w:tcBorders>
+            <w:shd w:val="clear" w:color="auto" w:fill="FFFFFF"/>
+            <w:tcMar>
+              <w:top w:w="70" w:type="dxa"/>
+              <w:left w:w="110" w:type="dxa"/>
+              <w:bottom w:w="70" w:type="dxa"/>
+              <w:right w:w="110" w:type="dxa"/>
+            </w:tcMar>
+          </w:tcPr>
+          <w:p>
+            <w:proofErr w:type="spellStart"/>
+            <w:r>
+              <w:rPr>
+                <w:b/>
+                <w:bCs/>
+                <w:color w:val="000000"/>
+                <w:sz w:val="17"/>
+                <w:szCs w:val="17"/>
+              </w:rPr>
+              <w:t>tipo_</w:t>
+            </w:r>
+            <w:r>
+              <w:rPr>
+                <w:b/>
+                <w:bCs/>
+                <w:color w:val="000000"/>
+                <w:sz w:val="17"/>
+                <w:szCs w:val="17"/>
+              </w:rPr>
+              <w:t>feedback</w:t>
+            </w:r>
+            <w:proofErr w:type="spellEnd"/>
+          </w:p>
+        </w:tc>
+        <w:tc>
+          <w:tcPr>
+            <w:tcW w:w="1600" w:type="dxa"/>
+            <w:tcBorders>
+              <w:top w:val="single" w:sz="1" w:space="0" w:color="AAAAAA"/>
+              <w:left w:val="single" w:sz="1" w:space="0" w:color="AAAAAA"/>
+              <w:bottom w:val="single" w:sz="1" w:space="0" w:color="AAAAAA"/>
+              <w:right w:val="single" w:sz="1" w:space="0" w:color="AAAAAA"/>
+            </w:tcBorders>
+            <w:shd w:val="clear" w:color="auto" w:fill="FFFFFF"/>
+            <w:tcMar>
+              <w:top w:w="70" w:type="dxa"/>
+              <w:left w:w="110" w:type="dxa"/>
+              <w:bottom w:w="70" w:type="dxa"/>
+              <w:right w:w="110" w:type="dxa"/>
+            </w:tcMar>
+          </w:tcPr>
+          <w:p>
+            <w:r>
+              <w:rPr>
+                <w:color w:val="000000"/>
+                <w:sz w:val="17"/>
+                <w:szCs w:val="17"/>
+              </w:rPr>
+              <w:t>ENUM</w:t>
+            </w:r>
+          </w:p>
+        </w:tc>
+        <w:tc>
+          <w:tcPr>
+            <w:tcW w:w="1800" w:type="dxa"/>
+            <w:tcBorders>
+              <w:top w:val="single" w:sz="1" w:space="0" w:color="AAAAAA"/>
+              <w:left w:val="single" w:sz="1" w:space="0" w:color="AAAAAA"/>
+              <w:bottom w:val="single" w:sz="1" w:space="0" w:color="AAAAAA"/>
+              <w:right w:val="single" w:sz="1" w:space="0" w:color="AAAAAA"/>
+            </w:tcBorders>
+            <w:shd w:val="clear" w:color="auto" w:fill="FFFFFF"/>
+            <w:tcMar>
+              <w:top w:w="70" w:type="dxa"/>
+              <w:left w:w="110" w:type="dxa"/>
+              <w:bottom w:w="70" w:type="dxa"/>
+              <w:right w:w="110" w:type="dxa"/>
+            </w:tcMar>
+          </w:tcPr>
+          <w:p>
+            <w:r>
+              <w:rPr>
+                <w:color w:val="000000"/>
+                <w:sz w:val="17"/>
+                <w:szCs w:val="17"/>
+              </w:rPr>
+              <w:t>NOT NULL</w:t>
+            </w:r>
+          </w:p>
+        </w:tc>
+        <w:tc>
+          <w:tcPr>
+            <w:tcW w:w="3300" w:type="dxa"/>
+            <w:tcBorders>
+              <w:top w:val="single" w:sz="1" w:space="0" w:color="AAAAAA"/>
+              <w:left w:val="single" w:sz="1" w:space="0" w:color="AAAAAA"/>
+              <w:bottom w:val="single" w:sz="1" w:space="0" w:color="AAAAAA"/>
+              <w:right w:val="single" w:sz="1" w:space="0" w:color="AAAAAA"/>
+            </w:tcBorders>
+            <w:shd w:val="clear" w:color="auto" w:fill="FFFFFF"/>
+            <w:tcMar>
+              <w:top w:w="70" w:type="dxa"/>
+              <w:left w:w="110" w:type="dxa"/>
+              <w:bottom w:w="70" w:type="dxa"/>
+              <w:right w:w="110" w:type="dxa"/>
+            </w:tcMar>
+          </w:tcPr>
+          <w:p>
+            <w:r>
+              <w:rPr>
+                <w:color w:val="000000"/>
+                <w:sz w:val="17"/>
+                <w:szCs w:val="17"/>
+              </w:rPr>
+              <w:t>(‘elogio’,’</w:t>
+            </w:r>
+            <w:proofErr w:type="spellStart"/>
+            <w:r>
+              <w:rPr>
+                <w:color w:val="000000"/>
+                <w:sz w:val="17"/>
+                <w:szCs w:val="17"/>
+              </w:rPr>
+              <w:t>sugestao</w:t>
+            </w:r>
+            <w:proofErr w:type="spellEnd"/>
+            <w:r>
+              <w:rPr>
+                <w:color w:val="000000"/>
+                <w:sz w:val="17"/>
+                <w:szCs w:val="17"/>
+              </w:rPr>
+              <w:t>’,’</w:t>
+            </w:r>
+            <w:proofErr w:type="spellStart"/>
+            <w:r>
+              <w:rPr>
+                <w:color w:val="000000"/>
+                <w:sz w:val="17"/>
+                <w:szCs w:val="17"/>
+              </w:rPr>
+              <w:t>critica’,’problema</w:t>
+            </w:r>
+            <w:proofErr w:type="spellEnd"/>
+            <w:r>
+              <w:rPr>
+                <w:color w:val="000000"/>
+                <w:sz w:val="17"/>
+                <w:szCs w:val="17"/>
+              </w:rPr>
+              <w:t>’)</w:t>
+            </w:r>
+          </w:p>
+        </w:tc>
+      </w:tr>
+      <w:tr>
+        <w:tc>
+          <w:tcPr>
+            <w:tcW w:w="2500" w:type="dxa"/>
+            <w:tcBorders>
+              <w:top w:val="single" w:sz="1" w:space="0" w:color="AAAAAA"/>
+              <w:left w:val="single" w:sz="1" w:space="0" w:color="AAAAAA"/>
+              <w:bottom w:val="single" w:sz="1" w:space="0" w:color="AAAAAA"/>
+              <w:right w:val="single" w:sz="1" w:space="0" w:color="AAAAAA"/>
+            </w:tcBorders>
+            <w:shd w:val="clear" w:color="auto" w:fill="EEF4FF"/>
+            <w:tcMar>
+              <w:top w:w="70" w:type="dxa"/>
+              <w:left w:w="110" w:type="dxa"/>
+              <w:bottom w:w="70" w:type="dxa"/>
+              <w:right w:w="110" w:type="dxa"/>
+            </w:tcMar>
+          </w:tcPr>
+          <w:p>
+            <w:proofErr w:type="spellStart"/>
+            <w:r>
+              <w:rPr>
+                <w:b/>
+                <w:bCs/>
+                <w:color w:val="000000"/>
+                <w:sz w:val="17"/>
+                <w:szCs w:val="17"/>
+              </w:rPr>
+              <w:t>catrgorias_feedback</w:t>
+            </w:r>
+            <w:proofErr w:type="spellEnd"/>
+          </w:p>
+        </w:tc>
+        <w:tc>
+          <w:tcPr>
+            <w:tcW w:w="1600" w:type="dxa"/>
+            <w:tcBorders>
+              <w:top w:val="single" w:sz="1" w:space="0" w:color="AAAAAA"/>
+              <w:left w:val="single" w:sz="1" w:space="0" w:color="AAAAAA"/>
+              <w:bottom w:val="single" w:sz="1" w:space="0" w:color="AAAAAA"/>
+              <w:right w:val="single" w:sz="1" w:space="0" w:color="AAAAAA"/>
+            </w:tcBorders>
+            <w:shd w:val="clear" w:color="auto" w:fill="EEF4FF"/>
+            <w:tcMar>
+              <w:top w:w="70" w:type="dxa"/>
+              <w:left w:w="110" w:type="dxa"/>
+              <w:bottom w:w="70" w:type="dxa"/>
+              <w:right w:w="110" w:type="dxa"/>
+            </w:tcMar>
+          </w:tcPr>
+          <w:p>
+            <w:proofErr w:type="gramStart"/>
+            <w:r>
+              <w:rPr>
+                <w:color w:val="000000"/>
+                <w:sz w:val="17"/>
+                <w:szCs w:val="17"/>
+              </w:rPr>
+              <w:t>VARCHAR(</w:t>
+            </w:r>
+            <w:proofErr w:type="gramEnd"/>
+            <w:r>
+              <w:rPr>
+                <w:color w:val="000000"/>
+                <w:sz w:val="17"/>
+                <w:szCs w:val="17"/>
+              </w:rPr>
+              <w:t>120)</w:t>
+            </w:r>
+          </w:p>
+        </w:tc>
+        <w:tc>
+          <w:tcPr>
+            <w:tcW w:w="1800" w:type="dxa"/>
+            <w:tcBorders>
+              <w:top w:val="single" w:sz="1" w:space="0" w:color="AAAAAA"/>
+              <w:left w:val="single" w:sz="1" w:space="0" w:color="AAAAAA"/>
+              <w:bottom w:val="single" w:sz="1" w:space="0" w:color="AAAAAA"/>
+              <w:right w:val="single" w:sz="1" w:space="0" w:color="AAAAAA"/>
+            </w:tcBorders>
+            <w:shd w:val="clear" w:color="auto" w:fill="EEF4FF"/>
+            <w:tcMar>
+              <w:top w:w="70" w:type="dxa"/>
+              <w:left w:w="110" w:type="dxa"/>
+              <w:bottom w:w="70" w:type="dxa"/>
+              <w:right w:w="110" w:type="dxa"/>
+            </w:tcMar>
+          </w:tcPr>
+          <w:p>
+            <w:r>
+              <w:rPr>
+                <w:color w:val="000000"/>
+                <w:sz w:val="17"/>
+                <w:szCs w:val="17"/>
+              </w:rPr>
+              <w:t>NOT NULL</w:t>
+            </w:r>
+          </w:p>
+        </w:tc>
+        <w:tc>
+          <w:tcPr>
+            <w:tcW w:w="3300" w:type="dxa"/>
+            <w:tcBorders>
+              <w:top w:val="single" w:sz="1" w:space="0" w:color="AAAAAA"/>
+              <w:left w:val="single" w:sz="1" w:space="0" w:color="AAAAAA"/>
+              <w:bottom w:val="single" w:sz="1" w:space="0" w:color="AAAAAA"/>
+              <w:right w:val="single" w:sz="1" w:space="0" w:color="AAAAAA"/>
+            </w:tcBorders>
+            <w:shd w:val="clear" w:color="auto" w:fill="EEF4FF"/>
+            <w:tcMar>
+              <w:top w:w="70" w:type="dxa"/>
+              <w:left w:w="110" w:type="dxa"/>
+              <w:bottom w:w="70" w:type="dxa"/>
+              <w:right w:w="110" w:type="dxa"/>
+            </w:tcMar>
+          </w:tcPr>
+          <w:p>
+            <w:r>
+              <w:rPr>
+                <w:color w:val="000000"/>
+                <w:sz w:val="17"/>
+                <w:szCs w:val="17"/>
+              </w:rPr>
+              <w:t>Categorias do problema relatado</w:t>
+            </w:r>
+          </w:p>
+        </w:tc>
+      </w:tr>
+      <w:tr>
+        <w:tc>
+          <w:tcPr>
+            <w:tcW w:w="2500" w:type="dxa"/>
+            <w:tcBorders>
+              <w:top w:val="single" w:sz="1" w:space="0" w:color="AAAAAA"/>
+              <w:left w:val="single" w:sz="1" w:space="0" w:color="AAAAAA"/>
+              <w:bottom w:val="single" w:sz="1" w:space="0" w:color="AAAAAA"/>
+              <w:right w:val="single" w:sz="1" w:space="0" w:color="AAAAAA"/>
+            </w:tcBorders>
+            <w:shd w:val="clear" w:color="auto" w:fill="FFFFFF"/>
+            <w:tcMar>
+              <w:top w:w="70" w:type="dxa"/>
+              <w:left w:w="110" w:type="dxa"/>
+              <w:bottom w:w="70" w:type="dxa"/>
+              <w:right w:w="110" w:type="dxa"/>
+            </w:tcMar>
+          </w:tcPr>
+          <w:p>
+            <w:proofErr w:type="spellStart"/>
+            <w:r>
+              <w:rPr>
+                <w:b/>
+                <w:bCs/>
+                <w:color w:val="000000"/>
+                <w:sz w:val="17"/>
+                <w:szCs w:val="17"/>
+              </w:rPr>
+              <w:t>mensagem_feedback</w:t>
+            </w:r>
+            <w:proofErr w:type="spellEnd"/>
+          </w:p>
+        </w:tc>
+        <w:tc>
+          <w:tcPr>
+            <w:tcW w:w="1600" w:type="dxa"/>
+            <w:tcBorders>
+              <w:top w:val="single" w:sz="1" w:space="0" w:color="AAAAAA"/>
+              <w:left w:val="single" w:sz="1" w:space="0" w:color="AAAAAA"/>
+              <w:bottom w:val="single" w:sz="1" w:space="0" w:color="AAAAAA"/>
+              <w:right w:val="single" w:sz="1" w:space="0" w:color="AAAAAA"/>
+            </w:tcBorders>
+            <w:shd w:val="clear" w:color="auto" w:fill="FFFFFF"/>
+            <w:tcMar>
+              <w:top w:w="70" w:type="dxa"/>
+              <w:left w:w="110" w:type="dxa"/>
+              <w:bottom w:w="70" w:type="dxa"/>
+              <w:right w:w="110" w:type="dxa"/>
+            </w:tcMar>
+          </w:tcPr>
+          <w:p>
+            <w:r>
+              <w:rPr>
+                <w:color w:val="000000"/>
+                <w:sz w:val="17"/>
+                <w:szCs w:val="17"/>
+              </w:rPr>
+              <w:t>T</w:t>
+            </w:r>
+            <w:r>
+              <w:rPr>
+                <w:color w:val="000000"/>
+                <w:sz w:val="17"/>
+                <w:szCs w:val="17"/>
+              </w:rPr>
+              <w:t>EXT</w:t>
+            </w:r>
+          </w:p>
+        </w:tc>
+        <w:tc>
+          <w:tcPr>
+            <w:tcW w:w="1800" w:type="dxa"/>
+            <w:tcBorders>
+              <w:top w:val="single" w:sz="1" w:space="0" w:color="AAAAAA"/>
+              <w:left w:val="single" w:sz="1" w:space="0" w:color="AAAAAA"/>
+              <w:bottom w:val="single" w:sz="1" w:space="0" w:color="AAAAAA"/>
+              <w:right w:val="single" w:sz="1" w:space="0" w:color="AAAAAA"/>
+            </w:tcBorders>
+            <w:shd w:val="clear" w:color="auto" w:fill="FFFFFF"/>
+            <w:tcMar>
+              <w:top w:w="70" w:type="dxa"/>
+              <w:left w:w="110" w:type="dxa"/>
+              <w:bottom w:w="70" w:type="dxa"/>
+              <w:right w:w="110" w:type="dxa"/>
+            </w:tcMar>
+          </w:tcPr>
+          <w:p>
+            <w:r>
+              <w:rPr>
+                <w:color w:val="000000"/>
+                <w:sz w:val="17"/>
+                <w:szCs w:val="17"/>
+              </w:rPr>
+              <w:t>NOT NULL</w:t>
+            </w:r>
+          </w:p>
+        </w:tc>
+        <w:tc>
+          <w:tcPr>
+            <w:tcW w:w="3300" w:type="dxa"/>
+            <w:tcBorders>
+              <w:top w:val="single" w:sz="1" w:space="0" w:color="AAAAAA"/>
+              <w:left w:val="single" w:sz="1" w:space="0" w:color="AAAAAA"/>
+              <w:bottom w:val="single" w:sz="1" w:space="0" w:color="AAAAAA"/>
+              <w:right w:val="single" w:sz="1" w:space="0" w:color="AAAAAA"/>
+            </w:tcBorders>
+            <w:shd w:val="clear" w:color="auto" w:fill="FFFFFF"/>
+            <w:tcMar>
+              <w:top w:w="70" w:type="dxa"/>
+              <w:left w:w="110" w:type="dxa"/>
+              <w:bottom w:w="70" w:type="dxa"/>
+              <w:right w:w="110" w:type="dxa"/>
+            </w:tcMar>
+          </w:tcPr>
+          <w:p>
+            <w:r>
+              <w:rPr>
+                <w:color w:val="000000"/>
+                <w:sz w:val="17"/>
+                <w:szCs w:val="17"/>
+              </w:rPr>
+              <w:t>Mensagem do usuário</w:t>
+            </w:r>
+          </w:p>
+        </w:tc>
+      </w:tr>
+      <w:tr>
+        <w:tc>
+          <w:tcPr>
+            <w:tcW w:w="2500" w:type="dxa"/>
+            <w:tcBorders>
+              <w:top w:val="single" w:sz="1" w:space="0" w:color="AAAAAA"/>
+              <w:left w:val="single" w:sz="1" w:space="0" w:color="AAAAAA"/>
+              <w:bottom w:val="single" w:sz="1" w:space="0" w:color="AAAAAA"/>
+              <w:right w:val="single" w:sz="1" w:space="0" w:color="AAAAAA"/>
+            </w:tcBorders>
+            <w:shd w:val="clear" w:color="auto" w:fill="FFFFFF"/>
+            <w:tcMar>
+              <w:top w:w="70" w:type="dxa"/>
+              <w:left w:w="110" w:type="dxa"/>
+              <w:bottom w:w="70" w:type="dxa"/>
+              <w:right w:w="110" w:type="dxa"/>
+            </w:tcMar>
+          </w:tcPr>
+          <w:p>
+            <w:pPr>
+              <w:rPr>
+                <w:b/>
+                <w:bCs/>
+                <w:color w:val="000000"/>
+                <w:sz w:val="17"/>
+                <w:szCs w:val="17"/>
+              </w:rPr>
+            </w:pPr>
+            <w:proofErr w:type="spellStart"/>
+            <w:r>
+              <w:rPr>
+                <w:b/>
+                <w:bCs/>
+                <w:color w:val="000000"/>
+                <w:sz w:val="17"/>
+                <w:szCs w:val="17"/>
+              </w:rPr>
+              <w:t>data_feedback</w:t>
+            </w:r>
+            <w:proofErr w:type="spellEnd"/>
+          </w:p>
+        </w:tc>
+        <w:tc>
+          <w:tcPr>
+            <w:tcW w:w="1600" w:type="dxa"/>
+            <w:tcBorders>
+              <w:top w:val="single" w:sz="1" w:space="0" w:color="AAAAAA"/>
+              <w:left w:val="single" w:sz="1" w:space="0" w:color="AAAAAA"/>
+              <w:bottom w:val="single" w:sz="1" w:space="0" w:color="AAAAAA"/>
+              <w:right w:val="single" w:sz="1" w:space="0" w:color="AAAAAA"/>
+            </w:tcBorders>
+            <w:shd w:val="clear" w:color="auto" w:fill="FFFFFF"/>
+            <w:tcMar>
+              <w:top w:w="70" w:type="dxa"/>
+              <w:left w:w="110" w:type="dxa"/>
+              <w:bottom w:w="70" w:type="dxa"/>
+              <w:right w:w="110" w:type="dxa"/>
+            </w:tcMar>
+          </w:tcPr>
+          <w:p>
+            <w:pPr>
+              <w:rPr>
+                <w:color w:val="000000"/>
+                <w:sz w:val="17"/>
+                <w:szCs w:val="17"/>
+              </w:rPr>
+            </w:pPr>
+            <w:r>
+              <w:rPr>
+                <w:color w:val="000000"/>
+                <w:sz w:val="17"/>
+                <w:szCs w:val="17"/>
+              </w:rPr>
+              <w:t>DATETIME</w:t>
+            </w:r>
+          </w:p>
+        </w:tc>
+        <w:tc>
+          <w:tcPr>
+            <w:tcW w:w="1800" w:type="dxa"/>
+            <w:tcBorders>
+              <w:top w:val="single" w:sz="1" w:space="0" w:color="AAAAAA"/>
+              <w:left w:val="single" w:sz="1" w:space="0" w:color="AAAAAA"/>
+              <w:bottom w:val="single" w:sz="1" w:space="0" w:color="AAAAAA"/>
+              <w:right w:val="single" w:sz="1" w:space="0" w:color="AAAAAA"/>
+            </w:tcBorders>
+            <w:shd w:val="clear" w:color="auto" w:fill="FFFFFF"/>
+            <w:tcMar>
+              <w:top w:w="70" w:type="dxa"/>
+              <w:left w:w="110" w:type="dxa"/>
+              <w:bottom w:w="70" w:type="dxa"/>
+              <w:right w:w="110" w:type="dxa"/>
+            </w:tcMar>
+          </w:tcPr>
+          <w:p>
+            <w:pPr>
+              <w:rPr>
+                <w:color w:val="000000"/>
+                <w:sz w:val="17"/>
+                <w:szCs w:val="17"/>
+              </w:rPr>
+            </w:pPr>
+            <w:r>
+              <w:rPr>
+                <w:color w:val="000000"/>
+                <w:sz w:val="17"/>
+                <w:szCs w:val="17"/>
+              </w:rPr>
+              <w:t xml:space="preserve">DEFAULT </w:t>
+            </w:r>
+            <w:proofErr w:type="spellStart"/>
+            <w:r>
+              <w:rPr>
+                <w:color w:val="000000"/>
+                <w:sz w:val="17"/>
+                <w:szCs w:val="17"/>
+              </w:rPr>
+              <w:t>current_timestamp</w:t>
+            </w:r>
+            <w:proofErr w:type="spellEnd"/>
+          </w:p>
+        </w:tc>
+        <w:tc>
+          <w:tcPr>
+            <w:tcW w:w="3300" w:type="dxa"/>
+            <w:tcBorders>
+              <w:top w:val="single" w:sz="1" w:space="0" w:color="AAAAAA"/>
+              <w:left w:val="single" w:sz="1" w:space="0" w:color="AAAAAA"/>
+              <w:bottom w:val="single" w:sz="1" w:space="0" w:color="AAAAAA"/>
+              <w:right w:val="single" w:sz="1" w:space="0" w:color="AAAAAA"/>
+            </w:tcBorders>
+            <w:shd w:val="clear" w:color="auto" w:fill="FFFFFF"/>
+            <w:tcMar>
+              <w:top w:w="70" w:type="dxa"/>
+              <w:left w:w="110" w:type="dxa"/>
+              <w:bottom w:w="70" w:type="dxa"/>
+              <w:right w:w="110" w:type="dxa"/>
+            </w:tcMar>
+          </w:tcPr>
+          <w:p>
+            <w:pPr>
+              <w:rPr>
+                <w:color w:val="000000"/>
+                <w:sz w:val="17"/>
+                <w:szCs w:val="17"/>
+              </w:rPr>
+            </w:pPr>
+            <w:r>
+              <w:rPr>
+                <w:color w:val="000000"/>
+                <w:sz w:val="17"/>
+                <w:szCs w:val="17"/>
+              </w:rPr>
+              <w:t>Registra as horas minutos e segundos que o usuário fez o seu feedback</w:t>
+            </w:r>
+          </w:p>
+        </w:tc>
+      </w:tr>
+      <w:tr>
+        <w:tc>
+          <w:tcPr>
+            <w:tcW w:w="2500" w:type="dxa"/>
+            <w:tcBorders>
+              <w:top w:val="single" w:sz="1" w:space="0" w:color="AAAAAA"/>
+              <w:left w:val="single" w:sz="1" w:space="0" w:color="AAAAAA"/>
+              <w:bottom w:val="single" w:sz="1" w:space="0" w:color="AAAAAA"/>
+              <w:right w:val="single" w:sz="1" w:space="0" w:color="AAAAAA"/>
+            </w:tcBorders>
+            <w:shd w:val="clear" w:color="auto" w:fill="FFFFFF"/>
+            <w:tcMar>
+              <w:top w:w="70" w:type="dxa"/>
+              <w:left w:w="110" w:type="dxa"/>
+              <w:bottom w:w="70" w:type="dxa"/>
+              <w:right w:w="110" w:type="dxa"/>
+            </w:tcMar>
+          </w:tcPr>
+          <w:p>
+            <w:pPr>
+              <w:rPr>
+                <w:b/>
+                <w:bCs/>
+                <w:color w:val="000000"/>
+                <w:sz w:val="17"/>
+                <w:szCs w:val="17"/>
+              </w:rPr>
+            </w:pPr>
+            <w:proofErr w:type="spellStart"/>
+            <w:r>
+              <w:rPr>
+                <w:b/>
+                <w:bCs/>
+                <w:color w:val="000000"/>
+                <w:sz w:val="17"/>
+                <w:szCs w:val="17"/>
+              </w:rPr>
+              <w:t>Status_feedback</w:t>
+            </w:r>
+            <w:proofErr w:type="spellEnd"/>
+          </w:p>
+        </w:tc>
+        <w:tc>
+          <w:tcPr>
+            <w:tcW w:w="1600" w:type="dxa"/>
+            <w:tcBorders>
+              <w:top w:val="single" w:sz="1" w:space="0" w:color="AAAAAA"/>
+              <w:left w:val="single" w:sz="1" w:space="0" w:color="AAAAAA"/>
+              <w:bottom w:val="single" w:sz="1" w:space="0" w:color="AAAAAA"/>
+              <w:right w:val="single" w:sz="1" w:space="0" w:color="AAAAAA"/>
+            </w:tcBorders>
+            <w:shd w:val="clear" w:color="auto" w:fill="FFFFFF"/>
+            <w:tcMar>
+              <w:top w:w="70" w:type="dxa"/>
+              <w:left w:w="110" w:type="dxa"/>
+              <w:bottom w:w="70" w:type="dxa"/>
+              <w:right w:w="110" w:type="dxa"/>
+            </w:tcMar>
+          </w:tcPr>
+          <w:p>
+            <w:pPr>
+              <w:rPr>
+                <w:color w:val="000000"/>
+                <w:sz w:val="17"/>
+                <w:szCs w:val="17"/>
+              </w:rPr>
+            </w:pPr>
+            <w:r>
+              <w:rPr>
+                <w:color w:val="000000"/>
+                <w:sz w:val="17"/>
+                <w:szCs w:val="17"/>
+              </w:rPr>
+              <w:t>ENUM</w:t>
+            </w:r>
+          </w:p>
+        </w:tc>
+        <w:tc>
+          <w:tcPr>
+            <w:tcW w:w="1800" w:type="dxa"/>
+            <w:tcBorders>
+              <w:top w:val="single" w:sz="1" w:space="0" w:color="AAAAAA"/>
+              <w:left w:val="single" w:sz="1" w:space="0" w:color="AAAAAA"/>
+              <w:bottom w:val="single" w:sz="1" w:space="0" w:color="AAAAAA"/>
+              <w:right w:val="single" w:sz="1" w:space="0" w:color="AAAAAA"/>
+            </w:tcBorders>
+            <w:shd w:val="clear" w:color="auto" w:fill="FFFFFF"/>
+            <w:tcMar>
+              <w:top w:w="70" w:type="dxa"/>
+              <w:left w:w="110" w:type="dxa"/>
+              <w:bottom w:w="70" w:type="dxa"/>
+              <w:right w:w="110" w:type="dxa"/>
+            </w:tcMar>
+          </w:tcPr>
+          <w:p>
+            <w:pPr>
+              <w:rPr>
+                <w:color w:val="000000"/>
+                <w:sz w:val="17"/>
+                <w:szCs w:val="17"/>
+              </w:rPr>
+            </w:pPr>
+            <w:r>
+              <w:rPr>
+                <w:color w:val="000000"/>
+                <w:sz w:val="17"/>
+                <w:szCs w:val="17"/>
+              </w:rPr>
+              <w:t>DEFAULT</w:t>
+            </w:r>
+          </w:p>
+        </w:tc>
+        <w:tc>
+          <w:tcPr>
+            <w:tcW w:w="3300" w:type="dxa"/>
+            <w:tcBorders>
+              <w:top w:val="single" w:sz="1" w:space="0" w:color="AAAAAA"/>
+              <w:left w:val="single" w:sz="1" w:space="0" w:color="AAAAAA"/>
+              <w:bottom w:val="single" w:sz="1" w:space="0" w:color="AAAAAA"/>
+              <w:right w:val="single" w:sz="1" w:space="0" w:color="AAAAAA"/>
+            </w:tcBorders>
+            <w:shd w:val="clear" w:color="auto" w:fill="FFFFFF"/>
+            <w:tcMar>
+              <w:top w:w="70" w:type="dxa"/>
+              <w:left w:w="110" w:type="dxa"/>
+              <w:bottom w:w="70" w:type="dxa"/>
+              <w:right w:w="110" w:type="dxa"/>
+            </w:tcMar>
+          </w:tcPr>
+          <w:p>
+            <w:pPr>
+              <w:rPr>
+                <w:color w:val="000000"/>
+                <w:sz w:val="17"/>
+                <w:szCs w:val="17"/>
+              </w:rPr>
+            </w:pPr>
+            <w:r>
+              <w:rPr>
+                <w:color w:val="000000"/>
+                <w:sz w:val="17"/>
+                <w:szCs w:val="17"/>
+              </w:rPr>
+              <w:t>(‘</w:t>
+            </w:r>
+            <w:proofErr w:type="spellStart"/>
+            <w:r>
+              <w:rPr>
+                <w:color w:val="000000"/>
+                <w:sz w:val="17"/>
+                <w:szCs w:val="17"/>
+              </w:rPr>
+              <w:t>pendente’,’lido’,’respondido</w:t>
+            </w:r>
+            <w:proofErr w:type="spellEnd"/>
+            <w:r>
+              <w:rPr>
+                <w:color w:val="000000"/>
+                <w:sz w:val="17"/>
+                <w:szCs w:val="17"/>
+              </w:rPr>
+              <w:t>’)</w:t>
             </w:r>
           </w:p>
         </w:tc>
@@ -15469,7 +16242,27 @@
       <w:pPr>
         <w:pStyle w:val="Ttulo1"/>
       </w:pPr>
+    </w:p>
+    <w:p>
+      <w:pPr>
+        <w:rPr>
+          <w:b/>
+          <w:bCs/>
+          <w:color w:val="1F4E79"/>
+          <w:sz w:val="36"/>
+          <w:szCs w:val="36"/>
+        </w:rPr>
+      </w:pPr>
       <w:r>
+        <w:br w:type="page"/>
+      </w:r>
+    </w:p>
+    <w:p>
+      <w:pPr>
+        <w:pStyle w:val="Ttulo1"/>
+      </w:pPr>
+      <w:r>
+        <w:lastRenderedPageBreak/>
         <w:t>3. Relacionamentos</w:t>
       </w:r>
     </w:p>
@@ -15497,12 +16290,6 @@
         <w:gridCol w:w="2674"/>
       </w:tblGrid>
       <w:tr>
-        <w:tblPrEx>
-          <w:tblCellMar>
-            <w:top w:w="0" w:type="dxa"/>
-            <w:bottom w:w="0" w:type="dxa"/>
-          </w:tblCellMar>
-        </w:tblPrEx>
         <w:trPr>
           <w:tblHeader/>
         </w:trPr>
@@ -15640,12 +16427,6 @@
         </w:tc>
       </w:tr>
       <w:tr>
-        <w:tblPrEx>
-          <w:tblCellMar>
-            <w:top w:w="0" w:type="dxa"/>
-            <w:bottom w:w="0" w:type="dxa"/>
-          </w:tblCellMar>
-        </w:tblPrEx>
         <w:tc>
           <w:tcPr>
             <w:tcW w:w="2600" w:type="dxa"/>
@@ -15795,12 +16576,6 @@
         </w:tc>
       </w:tr>
       <w:tr>
-        <w:tblPrEx>
-          <w:tblCellMar>
-            <w:top w:w="0" w:type="dxa"/>
-            <w:bottom w:w="0" w:type="dxa"/>
-          </w:tblCellMar>
-        </w:tblPrEx>
         <w:tc>
           <w:tcPr>
             <w:tcW w:w="2600" w:type="dxa"/>
@@ -15960,12 +16735,6 @@
         </w:tc>
       </w:tr>
       <w:tr>
-        <w:tblPrEx>
-          <w:tblCellMar>
-            <w:top w:w="0" w:type="dxa"/>
-            <w:bottom w:w="0" w:type="dxa"/>
-          </w:tblCellMar>
-        </w:tblPrEx>
         <w:tc>
           <w:tcPr>
             <w:tcW w:w="2600" w:type="dxa"/>
@@ -16115,12 +16884,6 @@
         </w:tc>
       </w:tr>
       <w:tr>
-        <w:tblPrEx>
-          <w:tblCellMar>
-            <w:top w:w="0" w:type="dxa"/>
-            <w:bottom w:w="0" w:type="dxa"/>
-          </w:tblCellMar>
-        </w:tblPrEx>
         <w:tc>
           <w:tcPr>
             <w:tcW w:w="2600" w:type="dxa"/>
@@ -16270,12 +17033,6 @@
         </w:tc>
       </w:tr>
       <w:tr>
-        <w:tblPrEx>
-          <w:tblCellMar>
-            <w:top w:w="0" w:type="dxa"/>
-            <w:bottom w:w="0" w:type="dxa"/>
-          </w:tblCellMar>
-        </w:tblPrEx>
         <w:tc>
           <w:tcPr>
             <w:tcW w:w="2600" w:type="dxa"/>
@@ -16417,12 +17174,6 @@
         </w:tc>
       </w:tr>
       <w:tr>
-        <w:tblPrEx>
-          <w:tblCellMar>
-            <w:top w:w="0" w:type="dxa"/>
-            <w:bottom w:w="0" w:type="dxa"/>
-          </w:tblCellMar>
-        </w:tblPrEx>
         <w:tc>
           <w:tcPr>
             <w:tcW w:w="2600" w:type="dxa"/>
@@ -16564,12 +17315,6 @@
         </w:tc>
       </w:tr>
       <w:tr>
-        <w:tblPrEx>
-          <w:tblCellMar>
-            <w:top w:w="0" w:type="dxa"/>
-            <w:bottom w:w="0" w:type="dxa"/>
-          </w:tblCellMar>
-        </w:tblPrEx>
         <w:tc>
           <w:tcPr>
             <w:tcW w:w="2600" w:type="dxa"/>
@@ -16729,12 +17474,6 @@
         </w:tc>
       </w:tr>
       <w:tr>
-        <w:tblPrEx>
-          <w:tblCellMar>
-            <w:top w:w="0" w:type="dxa"/>
-            <w:bottom w:w="0" w:type="dxa"/>
-          </w:tblCellMar>
-        </w:tblPrEx>
         <w:tc>
           <w:tcPr>
             <w:tcW w:w="2600" w:type="dxa"/>
@@ -16866,12 +17605,6 @@
         </w:tc>
       </w:tr>
       <w:tr>
-        <w:tblPrEx>
-          <w:tblCellMar>
-            <w:top w:w="0" w:type="dxa"/>
-            <w:bottom w:w="0" w:type="dxa"/>
-          </w:tblCellMar>
-        </w:tblPrEx>
         <w:tc>
           <w:tcPr>
             <w:tcW w:w="2600" w:type="dxa"/>
@@ -17039,12 +17772,6 @@
         </w:tc>
       </w:tr>
       <w:tr>
-        <w:tblPrEx>
-          <w:tblCellMar>
-            <w:top w:w="0" w:type="dxa"/>
-            <w:bottom w:w="0" w:type="dxa"/>
-          </w:tblCellMar>
-        </w:tblPrEx>
         <w:tc>
           <w:tcPr>
             <w:tcW w:w="2600" w:type="dxa"/>
@@ -17206,12 +17933,6 @@
         </w:tc>
       </w:tr>
       <w:tr>
-        <w:tblPrEx>
-          <w:tblCellMar>
-            <w:top w:w="0" w:type="dxa"/>
-            <w:bottom w:w="0" w:type="dxa"/>
-          </w:tblCellMar>
-        </w:tblPrEx>
         <w:tc>
           <w:tcPr>
             <w:tcW w:w="2600" w:type="dxa"/>
@@ -17371,12 +18092,6 @@
         </w:tc>
       </w:tr>
       <w:tr>
-        <w:tblPrEx>
-          <w:tblCellMar>
-            <w:top w:w="0" w:type="dxa"/>
-            <w:bottom w:w="0" w:type="dxa"/>
-          </w:tblCellMar>
-        </w:tblPrEx>
         <w:tc>
           <w:tcPr>
             <w:tcW w:w="2600" w:type="dxa"/>
@@ -17536,12 +18251,6 @@
         </w:tc>
       </w:tr>
       <w:tr>
-        <w:tblPrEx>
-          <w:tblCellMar>
-            <w:top w:w="0" w:type="dxa"/>
-            <w:bottom w:w="0" w:type="dxa"/>
-          </w:tblCellMar>
-        </w:tblPrEx>
         <w:tc>
           <w:tcPr>
             <w:tcW w:w="2600" w:type="dxa"/>
@@ -17673,12 +18382,6 @@
         </w:tc>
       </w:tr>
       <w:tr>
-        <w:tblPrEx>
-          <w:tblCellMar>
-            <w:top w:w="0" w:type="dxa"/>
-            <w:bottom w:w="0" w:type="dxa"/>
-          </w:tblCellMar>
-        </w:tblPrEx>
         <w:tc>
           <w:tcPr>
             <w:tcW w:w="2600" w:type="dxa"/>
@@ -17805,6 +18508,189 @@
                 <w:szCs w:val="17"/>
               </w:rPr>
               <w:t>Partida pode ter 1+ sumulas</w:t>
+            </w:r>
+          </w:p>
+        </w:tc>
+      </w:tr>
+      <w:tr>
+        <w:tc>
+          <w:tcPr>
+            <w:tcW w:w="2600" w:type="dxa"/>
+            <w:tcBorders>
+              <w:top w:val="single" w:sz="1" w:space="0" w:color="AAAAAA"/>
+              <w:left w:val="single" w:sz="1" w:space="0" w:color="AAAAAA"/>
+              <w:bottom w:val="single" w:sz="1" w:space="0" w:color="AAAAAA"/>
+              <w:right w:val="single" w:sz="1" w:space="0" w:color="AAAAAA"/>
+            </w:tcBorders>
+            <w:shd w:val="clear" w:color="auto" w:fill="EEF4FF"/>
+            <w:tcMar>
+              <w:top w:w="70" w:type="dxa"/>
+              <w:left w:w="110" w:type="dxa"/>
+              <w:bottom w:w="70" w:type="dxa"/>
+              <w:right w:w="110" w:type="dxa"/>
+            </w:tcMar>
+          </w:tcPr>
+          <w:p>
+            <w:pPr>
+              <w:rPr>
+                <w:color w:val="000000"/>
+                <w:sz w:val="17"/>
+                <w:szCs w:val="17"/>
+              </w:rPr>
+            </w:pPr>
+            <w:r>
+              <w:rPr>
+                <w:color w:val="000000"/>
+                <w:sz w:val="17"/>
+                <w:szCs w:val="17"/>
+              </w:rPr>
+              <w:t>USUARIO</w:t>
+            </w:r>
+          </w:p>
+        </w:tc>
+        <w:tc>
+          <w:tcPr>
+            <w:tcW w:w="1200" w:type="dxa"/>
+            <w:tcBorders>
+              <w:top w:val="single" w:sz="1" w:space="0" w:color="AAAAAA"/>
+              <w:left w:val="single" w:sz="1" w:space="0" w:color="AAAAAA"/>
+              <w:bottom w:val="single" w:sz="1" w:space="0" w:color="AAAAAA"/>
+              <w:right w:val="single" w:sz="1" w:space="0" w:color="AAAAAA"/>
+            </w:tcBorders>
+            <w:shd w:val="clear" w:color="auto" w:fill="EEF4FF"/>
+            <w:tcMar>
+              <w:top w:w="70" w:type="dxa"/>
+              <w:left w:w="110" w:type="dxa"/>
+              <w:bottom w:w="70" w:type="dxa"/>
+              <w:right w:w="110" w:type="dxa"/>
+            </w:tcMar>
+          </w:tcPr>
+          <w:p>
+            <w:pPr>
+              <w:jc w:val="center"/>
+              <w:rPr>
+                <w:b/>
+                <w:bCs/>
+                <w:color w:val="000000"/>
+                <w:sz w:val="17"/>
+                <w:szCs w:val="17"/>
+              </w:rPr>
+            </w:pPr>
+            <w:proofErr w:type="gramStart"/>
+            <w:r>
+              <w:rPr>
+                <w:b/>
+                <w:bCs/>
+                <w:color w:val="000000"/>
+                <w:sz w:val="17"/>
+                <w:szCs w:val="17"/>
+              </w:rPr>
+              <w:t>1 :</w:t>
+            </w:r>
+            <w:proofErr w:type="gramEnd"/>
+            <w:r>
+              <w:rPr>
+                <w:b/>
+                <w:bCs/>
+                <w:color w:val="000000"/>
+                <w:sz w:val="17"/>
+                <w:szCs w:val="17"/>
+              </w:rPr>
+              <w:t xml:space="preserve"> N</w:t>
+            </w:r>
+          </w:p>
+        </w:tc>
+        <w:tc>
+          <w:tcPr>
+            <w:tcW w:w="2600" w:type="dxa"/>
+            <w:tcBorders>
+              <w:top w:val="single" w:sz="1" w:space="0" w:color="AAAAAA"/>
+              <w:left w:val="single" w:sz="1" w:space="0" w:color="AAAAAA"/>
+              <w:bottom w:val="single" w:sz="1" w:space="0" w:color="AAAAAA"/>
+              <w:right w:val="single" w:sz="1" w:space="0" w:color="AAAAAA"/>
+            </w:tcBorders>
+            <w:shd w:val="clear" w:color="auto" w:fill="EEF4FF"/>
+            <w:tcMar>
+              <w:top w:w="70" w:type="dxa"/>
+              <w:left w:w="110" w:type="dxa"/>
+              <w:bottom w:w="70" w:type="dxa"/>
+              <w:right w:w="110" w:type="dxa"/>
+            </w:tcMar>
+          </w:tcPr>
+          <w:p>
+            <w:pPr>
+              <w:rPr>
+                <w:color w:val="000000"/>
+                <w:sz w:val="17"/>
+                <w:szCs w:val="17"/>
+              </w:rPr>
+            </w:pPr>
+            <w:r>
+              <w:rPr>
+                <w:color w:val="000000"/>
+                <w:sz w:val="17"/>
+                <w:szCs w:val="17"/>
+              </w:rPr>
+              <w:t>FEEDBACK</w:t>
+            </w:r>
+          </w:p>
+        </w:tc>
+        <w:tc>
+          <w:tcPr>
+            <w:tcW w:w="2800" w:type="dxa"/>
+            <w:tcBorders>
+              <w:top w:val="single" w:sz="1" w:space="0" w:color="AAAAAA"/>
+              <w:left w:val="single" w:sz="1" w:space="0" w:color="AAAAAA"/>
+              <w:bottom w:val="single" w:sz="1" w:space="0" w:color="AAAAAA"/>
+              <w:right w:val="single" w:sz="1" w:space="0" w:color="AAAAAA"/>
+            </w:tcBorders>
+            <w:shd w:val="clear" w:color="auto" w:fill="EEF4FF"/>
+            <w:tcMar>
+              <w:top w:w="70" w:type="dxa"/>
+              <w:left w:w="110" w:type="dxa"/>
+              <w:bottom w:w="70" w:type="dxa"/>
+              <w:right w:w="110" w:type="dxa"/>
+            </w:tcMar>
+          </w:tcPr>
+          <w:p>
+            <w:pPr>
+              <w:rPr>
+                <w:color w:val="000000"/>
+                <w:sz w:val="17"/>
+                <w:szCs w:val="17"/>
+              </w:rPr>
+            </w:pPr>
+            <w:r>
+              <w:rPr>
+                <w:color w:val="000000"/>
+                <w:sz w:val="17"/>
+                <w:szCs w:val="17"/>
+              </w:rPr>
+              <w:t>Vários usuários</w:t>
+            </w:r>
+            <w:r>
+              <w:rPr>
+                <w:color w:val="000000"/>
+                <w:sz w:val="17"/>
+                <w:szCs w:val="17"/>
+              </w:rPr>
+              <w:t xml:space="preserve"> pode</w:t>
+            </w:r>
+            <w:r>
+              <w:rPr>
+                <w:color w:val="000000"/>
+                <w:sz w:val="17"/>
+                <w:szCs w:val="17"/>
+              </w:rPr>
+              <w:t>m</w:t>
+            </w:r>
+            <w:r>
+              <w:rPr>
+                <w:color w:val="000000"/>
+                <w:sz w:val="17"/>
+                <w:szCs w:val="17"/>
+              </w:rPr>
+              <w:t xml:space="preserve"> fazer vários feedbacks</w:t>
             </w:r>
           </w:p>
         </w:tc>
@@ -17820,7 +18706,6 @@
         <w:pStyle w:val="Ttulo1"/>
       </w:pPr>
       <w:r>
-        <w:lastRenderedPageBreak/>
         <w:t>4. Decisões de Design</w:t>
       </w:r>
     </w:p>
@@ -17989,7 +18874,11 @@
       </w:r>
       <w:proofErr w:type="spellEnd"/>
       <w:r>
-        <w:t xml:space="preserve"> = 0', mantendo o histórico. O campo '</w:t>
+        <w:t xml:space="preserve"> = 0', mantendo o </w:t>
+      </w:r>
+      <w:r>
+        <w:lastRenderedPageBreak/>
+        <w:t>histórico. O campo '</w:t>
       </w:r>
       <w:proofErr w:type="spellStart"/>
       <w:r>
@@ -17999,6 +18888,11 @@
       <w:r>
         <w:t>' na tabela USUARIO guarda o caminho atual como atalho para evitar JOIN toda hora.</w:t>
       </w:r>
+    </w:p>
+    <w:p>
+      <w:pPr>
+        <w:spacing w:before="120" w:after="60"/>
+      </w:pPr>
     </w:p>
     <w:p>
       <w:pPr>
@@ -18050,6 +18944,38 @@
     </w:p>
     <w:p>
       <w:pPr>
+        <w:spacing w:before="120" w:after="60"/>
+      </w:pPr>
+      <w:r>
+        <w:rPr>
+          <w:b/>
+          <w:bCs/>
+          <w:color w:val="1F4E79"/>
+        </w:rPr>
+        <w:t xml:space="preserve">• </w:t>
+      </w:r>
+      <w:r>
+        <w:rPr>
+          <w:b/>
+          <w:bCs/>
+          <w:color w:val="1F4E79"/>
+        </w:rPr>
+        <w:t>Feedback</w:t>
+      </w:r>
+      <w:r>
+        <w:rPr>
+          <w:b/>
+          <w:bCs/>
+          <w:color w:val="1F4E79"/>
+        </w:rPr>
+        <w:t xml:space="preserve">: </w:t>
+      </w:r>
+      <w:r>
+        <w:t>Feedback guardará as opiniões dos usuários e com essa tabela podemos trabalhar baseado na opinião das pessoas que utilizam o site.</w:t>
+      </w:r>
+    </w:p>
+    <w:p>
+      <w:pPr>
         <w:pBdr>
           <w:top w:val="single" w:sz="2" w:space="0" w:color="1F4E79"/>
         </w:pBdr>
@@ -18070,7 +18996,7 @@
 </file>
 
 <file path=word/numbering.xml><?xml version="1.0" encoding="utf-8"?>
-<w:numbering xmlns:wpc="http://schemas.microsoft.com/office/word/2010/wordprocessingCanvas" xmlns:cx="http://schemas.microsoft.com/office/drawing/2014/chartex" xmlns:cx1="http://schemas.microsoft.com/office/drawing/2015/9/8/chartex" xmlns:cx2="http://schemas.microsoft.com/office/drawing/2015/10/21/chartex" xmlns:cx3="http://schemas.microsoft.com/office/drawing/2016/5/9/chartex" xmlns:cx4="http://schemas.microsoft.com/office/drawing/2016/5/10/chartex" xmlns:cx5="http://schemas.microsoft.com/office/drawing/2016/5/11/chartex" xmlns:cx6="http://schemas.microsoft.com/office/drawing/2016/5/12/chartex" xmlns:cx7="http://schemas.microsoft.com/office/drawing/2016/5/13/chartex" xmlns:cx8="http://schemas.microsoft.com/office/drawing/2016/5/14/chartex" xmlns:mc="http://schemas.openxmlformats.org/markup-compatibility/2006" xmlns:aink="http://schemas.microsoft.com/office/drawing/2016/ink" xmlns:am3d="http://schemas.microsoft.com/office/drawing/2017/model3d" xmlns:o="urn:schemas-microsoft-com:office:office" xmlns:oel="http://schemas.microsoft.com/office/2019/extlst" xmlns:r="http://schemas.openxmlformats.org/officeDocument/2006/relationships" xmlns:m="http://schemas.openxmlformats.org/officeDocument/2006/math" xmlns:v="urn:schemas-microsoft-com:vml" xmlns:wp14="http://schemas.microsoft.com/office/word/2010/wordprocessingDrawing" xmlns:wp="http://schemas.openxmlformats.org/drawingml/2006/wordprocessingDrawing" xmlns:w10="urn:schemas-microsoft-com:office:word" xmlns:w="http://schemas.openxmlformats.org/wordprocessingml/2006/main" xmlns:w14="http://schemas.microsoft.com/office/word/2010/wordml" xmlns:w15="http://schemas.microsoft.com/office/word/2012/wordml" xmlns:w16cex="http://schemas.microsoft.com/office/word/2018/wordml/cex" xmlns:w16cid="http://schemas.microsoft.com/office/word/2016/wordml/cid" xmlns:w16="http://schemas.microsoft.com/office/word/2018/wordml" xmlns:w16du="http://schemas.microsoft.com/office/word/2023/wordml/word16du" xmlns:w16sdtdh="http://schemas.microsoft.com/office/word/2020/wordml/sdtdatahash" xmlns:w16sdtfl="http://schemas.microsoft.com/office/word/2024/wordml/sdtformatlock" xmlns:w16se="http://schemas.microsoft.com/office/word/2015/wordml/symex" xmlns:wpg="http://schemas.microsoft.com/office/word/2010/wordprocessingGroup" xmlns:wpi="http://schemas.microsoft.com/office/word/2010/wordprocessingInk" xmlns:wne="http://schemas.microsoft.com/office/word/2006/wordml" xmlns:wps="http://schemas.microsoft.com/office/word/2010/wordprocessingShape" mc:Ignorable="w14 w15 w16se w16cid w16 w16cex w16sdtdh w16sdtfl w16du wp14">
+<w:numbering xmlns:wpc="http://schemas.microsoft.com/office/word/2010/wordprocessingCanvas" xmlns:cx="http://schemas.microsoft.com/office/drawing/2014/chartex" xmlns:cx1="http://schemas.microsoft.com/office/drawing/2015/9/8/chartex" xmlns:cx2="http://schemas.microsoft.com/office/drawing/2015/10/21/chartex" xmlns:cx3="http://schemas.microsoft.com/office/drawing/2016/5/9/chartex" xmlns:cx4="http://schemas.microsoft.com/office/drawing/2016/5/10/chartex" xmlns:cx5="http://schemas.microsoft.com/office/drawing/2016/5/11/chartex" xmlns:cx6="http://schemas.microsoft.com/office/drawing/2016/5/12/chartex" xmlns:cx7="http://schemas.microsoft.com/office/drawing/2016/5/13/chartex" xmlns:cx8="http://schemas.microsoft.com/office/drawing/2016/5/14/chartex" xmlns:mc="http://schemas.openxmlformats.org/markup-compatibility/2006" xmlns:aink="http://schemas.microsoft.com/office/drawing/2016/ink" xmlns:am3d="http://schemas.microsoft.com/office/drawing/2017/model3d" xmlns:o="urn:schemas-microsoft-com:office:office" xmlns:oel="http://schemas.microsoft.com/office/2019/extlst" xmlns:r="http://schemas.openxmlformats.org/officeDocument/2006/relationships" xmlns:m="http://schemas.openxmlformats.org/officeDocument/2006/math" xmlns:v="urn:schemas-microsoft-com:vml" xmlns:wp14="http://schemas.microsoft.com/office/word/2010/wordprocessingDrawing" xmlns:wp="http://schemas.openxmlformats.org/drawingml/2006/wordprocessingDrawing" xmlns:w10="urn:schemas-microsoft-com:office:word" xmlns:w="http://schemas.openxmlformats.org/wordprocessingml/2006/main" xmlns:w14="http://schemas.microsoft.com/office/word/2010/wordml" xmlns:w15="http://schemas.microsoft.com/office/word/2012/wordml" xmlns:w16cex="http://schemas.microsoft.com/office/word/2018/wordml/cex" xmlns:w16cid="http://schemas.microsoft.com/office/word/2016/wordml/cid" xmlns:w16="http://schemas.microsoft.com/office/word/2018/wordml" xmlns:w16sdtdh="http://schemas.microsoft.com/office/word/2020/wordml/sdtdatahash" xmlns:w16se="http://schemas.microsoft.com/office/word/2015/wordml/symex" xmlns:wpg="http://schemas.microsoft.com/office/word/2010/wordprocessingGroup" xmlns:wpi="http://schemas.microsoft.com/office/word/2010/wordprocessingInk" xmlns:wne="http://schemas.microsoft.com/office/word/2006/wordml" xmlns:wps="http://schemas.microsoft.com/office/word/2010/wordprocessingShape" mc:Ignorable="w14 w15 w16se w16cid w16 w16cex w16sdtdh wp14">
   <w:abstractNum w:abstractNumId="0" w15:restartNumberingAfterBreak="0">
     <w:nsid w:val="3404323E"/>
     <w:multiLevelType w:val="hybridMultilevel"/>
@@ -18167,7 +19093,7 @@
 </file>
 
 <file path=word/styles.xml><?xml version="1.0" encoding="utf-8"?>
-<w:styles xmlns:mc="http://schemas.openxmlformats.org/markup-compatibility/2006" xmlns:r="http://schemas.openxmlformats.org/officeDocument/2006/relationships" xmlns:w="http://schemas.openxmlformats.org/wordprocessingml/2006/main" xmlns:w14="http://schemas.microsoft.com/office/word/2010/wordml" xmlns:w15="http://schemas.microsoft.com/office/word/2012/wordml" xmlns:w16cex="http://schemas.microsoft.com/office/word/2018/wordml/cex" xmlns:w16cid="http://schemas.microsoft.com/office/word/2016/wordml/cid" xmlns:w16="http://schemas.microsoft.com/office/word/2018/wordml" xmlns:w16du="http://schemas.microsoft.com/office/word/2023/wordml/word16du" xmlns:w16sdtdh="http://schemas.microsoft.com/office/word/2020/wordml/sdtdatahash" xmlns:w16sdtfl="http://schemas.microsoft.com/office/word/2024/wordml/sdtformatlock" xmlns:w16se="http://schemas.microsoft.com/office/word/2015/wordml/symex" mc:Ignorable="w14 w15 w16se w16cid w16 w16cex w16sdtdh w16sdtfl w16du">
+<w:styles xmlns:mc="http://schemas.openxmlformats.org/markup-compatibility/2006" xmlns:r="http://schemas.openxmlformats.org/officeDocument/2006/relationships" xmlns:w="http://schemas.openxmlformats.org/wordprocessingml/2006/main" xmlns:w14="http://schemas.microsoft.com/office/word/2010/wordml" xmlns:w15="http://schemas.microsoft.com/office/word/2012/wordml" xmlns:w16cex="http://schemas.microsoft.com/office/word/2018/wordml/cex" xmlns:w16cid="http://schemas.microsoft.com/office/word/2016/wordml/cid" xmlns:w16="http://schemas.microsoft.com/office/word/2018/wordml" xmlns:w16sdtdh="http://schemas.microsoft.com/office/word/2020/wordml/sdtdatahash" xmlns:w16se="http://schemas.microsoft.com/office/word/2015/wordml/symex" mc:Ignorable="w14 w15 w16se w16cid w16 w16cex w16sdtdh">
   <w:docDefaults>
     <w:rPrDefault>
       <w:rPr>
@@ -19055,4 +19981,16 @@
     </a:ext>
   </a:extLst>
 </a:theme>
+</file>
+
+<file path=customXml/item1.xml><?xml version="1.0" encoding="utf-8"?>
+<b:Sources xmlns:b="http://schemas.openxmlformats.org/officeDocument/2006/bibliography" xmlns="http://schemas.openxmlformats.org/officeDocument/2006/bibliography" SelectedStyle="\APASixthEditionOfficeOnline.xsl" StyleName="APA" Version="6"/>
+</file>
+
+<file path=customXml/itemProps1.xml><?xml version="1.0" encoding="utf-8"?>
+<ds:datastoreItem xmlns:ds="http://schemas.openxmlformats.org/officeDocument/2006/customXml" ds:itemID="{2B0C3E64-348F-4E57-A47A-BAE3A3B94855}">
+  <ds:schemaRefs>
+    <ds:schemaRef ds:uri="http://schemas.openxmlformats.org/officeDocument/2006/bibliography"/>
+  </ds:schemaRefs>
+</ds:datastoreItem>
 </file>
</xml_diff>